<commit_message>
docs: reescreve declaração de uso de IA com tabela completa de commits
Co-authored-by: José Eduardo <jbr121@users.noreply.github.com>
</commit_message>
<xml_diff>
--- a/docs/CronotaScan_Uso_de_IA.docx
+++ b/docs/CronotaScan_Uso_de_IA.docx
@@ -5,7 +5,7 @@
     <w:p>
       <w:pPr>
         <w:pStyle w:val="Title"/>
-        <w:spacing w:after="120"/>
+        <w:spacing w:after="80"/>
         <w:jc w:val="center"/>
       </w:pPr>
       <w:r>
@@ -14,46 +14,90 @@
     </w:p>
     <w:p>
       <w:pPr>
+        <w:spacing w:after="40"/>
         <w:jc w:val="center"/>
       </w:pPr>
       <w:r>
         <w:rPr>
           <w:b/>
-          <w:sz w:val="26"/>
+          <w:sz w:val="24"/>
         </w:rPr>
         <w:t>Projeto Integrador — CronotaScan</w:t>
       </w:r>
     </w:p>
     <w:p>
       <w:pPr>
+        <w:spacing w:after="40"/>
         <w:jc w:val="center"/>
       </w:pPr>
       <w:r>
         <w:rPr>
-          <w:sz w:val="22"/>
+          <w:b w:val="0"/>
+          <w:sz w:val="24"/>
         </w:rPr>
-        <w:t>Disciplina: Engenharia de Software II  |  Universidade do Vale do Itajaí — UNIVALI</w:t>
+        <w:t>Disciplina: Engenharia de Software II</w:t>
       </w:r>
     </w:p>
     <w:p>
       <w:pPr>
+        <w:spacing w:after="40"/>
         <w:jc w:val="center"/>
       </w:pPr>
       <w:r>
         <w:rPr>
+          <w:b w:val="0"/>
+          <w:sz w:val="24"/>
+        </w:rPr>
+        <w:t>Universidade do Vale do Itajaí — UNIVALI</w:t>
+      </w:r>
+    </w:p>
+    <w:p>
+      <w:pPr>
+        <w:spacing w:after="40"/>
+        <w:jc w:val="center"/>
+      </w:pPr>
+      <w:r>
+        <w:rPr>
+          <w:b/>
+          <w:sz w:val="24"/>
+        </w:rPr>
+        <w:t>Grupo: José Eduardo, Márcio Fossa, Erick</w:t>
+      </w:r>
+    </w:p>
+    <w:p>
+      <w:pPr>
+        <w:spacing w:after="40"/>
+        <w:jc w:val="center"/>
+      </w:pPr>
+      <w:r>
+        <w:rPr>
+          <w:b w:val="0"/>
+          <w:sz w:val="24"/>
+        </w:rPr>
+        <w:t>Data de entrega: Outubro de 2026</w:t>
+      </w:r>
+    </w:p>
+    <w:p>
+      <w:pPr>
+        <w:spacing w:after="120"/>
+        <w:jc w:val="center"/>
+      </w:pPr>
+      <w:r>
+        <w:rPr>
+          <w:b w:val="0"/>
           <w:sz w:val="22"/>
         </w:rPr>
-        <w:t>Grupo: José Eduardo, Márcio Fossa, Erick</w:t>
+        <w:t>Repositório GitHub: https://github.com/jbr121/CRONOTACOGRAFOS</w:t>
       </w:r>
     </w:p>
     <w:p/>
     <w:p>
       <w:pPr>
         <w:pStyle w:val="Heading2"/>
-        <w:spacing w:before="240" w:after="120"/>
+        <w:spacing w:before="280" w:after="120"/>
       </w:pPr>
       <w:r>
-        <w:t>1. Introdução</w:t>
+        <w:t>1. Apresentação</w:t>
       </w:r>
     </w:p>
     <w:p>
@@ -66,13 +110,26 @@
           <w:b w:val="0"/>
           <w:sz w:val="24"/>
         </w:rPr>
-        <w:t>Em conformidade com a política de transparência acadêmica da UNIVALI, este documento descreve os pontos do projeto CronotaScan em que foram utilizadas ferramentas de Inteligência Artificial Generativa (IAG) como suporte ao desenvolvimento. O uso de IA não substituiu o raciocínio crítico da equipe: todas as sugestões geradas foram revisadas, adaptadas e validadas pelos integrantes do grupo antes de serem incorporadas ao projeto.</w:t>
+        <w:t>Em conformidade com a política de transparência acadêmica da UNIVALI, este documento descreve de forma detalhada todos os pontos do projeto CronotaScan em que ferramentas de Inteligência Artificial Generativa (IAG) foram utilizadas como suporte ao desenvolvimento. Inclui o histórico completo de commits do repositório GitHub, identificando quais foram realizados com auxílio da IA e quais foram feitos exclusivamente pela equipe.</w:t>
+      </w:r>
+    </w:p>
+    <w:p>
+      <w:pPr>
+        <w:spacing w:after="120"/>
+        <w:jc w:val="both"/>
+      </w:pPr>
+      <w:r>
+        <w:rPr>
+          <w:b w:val="0"/>
+          <w:sz w:val="24"/>
+        </w:rPr>
+        <w:t>O uso de IA não substituiu o raciocínio crítico da equipe: todas as sugestões geradas foram revisadas, adaptadas e validadas pelos integrantes antes de serem incorporadas. A equipe se responsabiliza integralmente pelo conteúdo entregue.</w:t>
       </w:r>
     </w:p>
     <w:p>
       <w:pPr>
         <w:pStyle w:val="Heading2"/>
-        <w:spacing w:before="240" w:after="120"/>
+        <w:spacing w:before="280" w:after="120"/>
       </w:pPr>
       <w:r>
         <w:t>2. Ferramenta de IA Utilizada</w:t>
@@ -88,16 +145,1268 @@
           <w:b w:val="0"/>
           <w:sz w:val="24"/>
         </w:rPr>
-        <w:t>A ferramenta utilizada foi o Cursor (https://cursor.com), um ambiente de desenvolvimento integrado com IA baseado no modelo Claude (Anthropic). Dentro do Cursor, utilizamos o modo Cloud Agent, que permite ao assistente ler e editar arquivos do projeto de forma autônoma sob supervisão do desenvolvedor.</w:t>
+        <w:t>Ferramenta: Cursor (https://cursor.com) — ambiente de desenvolvimento integrado com IA.</w:t>
+      </w:r>
+    </w:p>
+    <w:p>
+      <w:pPr>
+        <w:pStyle w:val="ListBullet"/>
+        <w:spacing w:after="80"/>
+      </w:pPr>
+      <w:r>
+        <w:rPr>
+          <w:sz w:val="24"/>
+        </w:rPr>
+        <w:t>Modelo de IA: Claude Opus 5.5 / Claude Sonnet 4.6 (Anthropic)</w:t>
+      </w:r>
+    </w:p>
+    <w:p>
+      <w:pPr>
+        <w:pStyle w:val="ListBullet"/>
+        <w:spacing w:after="80"/>
+      </w:pPr>
+      <w:r>
+        <w:rPr>
+          <w:sz w:val="24"/>
+        </w:rPr>
+        <w:t>Modo: Cloud Agent — o assistente lê, edita e faz commit de arquivos do projeto sob supervisão do desenvolvedor</w:t>
+      </w:r>
+    </w:p>
+    <w:p>
+      <w:pPr>
+        <w:pStyle w:val="ListBullet"/>
+        <w:spacing w:after="80"/>
+      </w:pPr>
+      <w:r>
+        <w:rPr>
+          <w:sz w:val="24"/>
+        </w:rPr>
+        <w:t>Identificação nos commits: o autor aparece como "Cursor Agent" ou como "Co-Authored-By: Claude Opus 5.5"</w:t>
+      </w:r>
+    </w:p>
+    <w:p>
+      <w:pPr>
+        <w:spacing w:after="120"/>
+        <w:jc w:val="both"/>
+      </w:pPr>
+      <w:r>
+        <w:rPr>
+          <w:b w:val="0"/>
+          <w:sz w:val="24"/>
+        </w:rPr>
+        <w:t>Cada commit feito com IA é identificado claramente no histórico do GitHub com o autor "Cursor Agent" ou com a linha Co-Authored-By. Os commits feitos somente pela equipe têm como autor o nome do integrante (jbr121 = José Eduardo, ErickFbort = Erick).</w:t>
       </w:r>
     </w:p>
     <w:p>
       <w:pPr>
         <w:pStyle w:val="Heading2"/>
-        <w:spacing w:before="240" w:after="120"/>
+        <w:spacing w:before="280" w:after="120"/>
       </w:pPr>
       <w:r>
-        <w:t>3. Onde a IA Foi Utilizada no Projeto</w:t>
+        <w:t>3. Histórico Completo de Commits</w:t>
+      </w:r>
+    </w:p>
+    <w:p>
+      <w:pPr>
+        <w:spacing w:after="120"/>
+        <w:jc w:val="both"/>
+      </w:pPr>
+      <w:r>
+        <w:rPr>
+          <w:b w:val="0"/>
+          <w:sz w:val="24"/>
+        </w:rPr>
+        <w:t>O repositório está em: https://github.com/jbr121/CRONOTACOGRAFOS</w:t>
+        <w:br/>
+        <w:t>A tabela abaixo lista todos os commits em ordem cronológica. Commits com fundo amarelo envolveram o uso de IA; commits com fundo branco foram feitos exclusivamente pela equipe.</w:t>
+      </w:r>
+    </w:p>
+    <w:tbl>
+      <w:tblPr>
+        <w:tblStyle w:val="TableGrid"/>
+        <w:tblW w:type="auto" w:w="0"/>
+        <w:tblLayout w:type="fixed"/>
+        <w:tblLook w:firstColumn="1" w:firstRow="1" w:lastColumn="0" w:lastRow="0" w:noHBand="0" w:noVBand="1" w:val="04A0"/>
+      </w:tblPr>
+      <w:tblGrid>
+        <w:gridCol w:w="2351"/>
+        <w:gridCol w:w="2351"/>
+        <w:gridCol w:w="2351"/>
+        <w:gridCol w:w="2351"/>
+      </w:tblGrid>
+      <w:tr>
+        <w:tc>
+          <w:tcPr>
+            <w:tcW w:type="dxa" w:w="1247"/>
+            <w:shd w:val="clear" w:color="auto" w:fill="1F3864"/>
+          </w:tcPr>
+          <w:p>
+            <w:pPr>
+              <w:spacing w:after="0"/>
+            </w:pPr>
+            <w:r/>
+            <w:r>
+              <w:rPr>
+                <w:b/>
+                <w:color w:val="FFFFFF"/>
+                <w:sz w:val="20"/>
+              </w:rPr>
+              <w:t>Hash</w:t>
+            </w:r>
+          </w:p>
+        </w:tc>
+        <w:tc>
+          <w:tcPr>
+            <w:tcW w:type="dxa" w:w="1984"/>
+            <w:shd w:val="clear" w:color="auto" w:fill="1F3864"/>
+          </w:tcPr>
+          <w:p>
+            <w:pPr>
+              <w:spacing w:after="0"/>
+            </w:pPr>
+            <w:r/>
+            <w:r>
+              <w:rPr>
+                <w:b/>
+                <w:color w:val="FFFFFF"/>
+                <w:sz w:val="20"/>
+              </w:rPr>
+              <w:t>Data / Autor</w:t>
+            </w:r>
+          </w:p>
+        </w:tc>
+        <w:tc>
+          <w:tcPr>
+            <w:tcW w:type="dxa" w:w="1984"/>
+            <w:shd w:val="clear" w:color="auto" w:fill="1F3864"/>
+          </w:tcPr>
+          <w:p>
+            <w:pPr>
+              <w:spacing w:after="0"/>
+            </w:pPr>
+            <w:r/>
+            <w:r>
+              <w:rPr>
+                <w:b/>
+                <w:color w:val="FFFFFF"/>
+                <w:sz w:val="20"/>
+              </w:rPr>
+              <w:t>Mensagem do Commit</w:t>
+            </w:r>
+          </w:p>
+        </w:tc>
+        <w:tc>
+          <w:tcPr>
+            <w:tcW w:type="dxa" w:w="4989"/>
+            <w:shd w:val="clear" w:color="auto" w:fill="1F3864"/>
+          </w:tcPr>
+          <w:p>
+            <w:pPr>
+              <w:spacing w:after="0"/>
+            </w:pPr>
+            <w:r/>
+            <w:r>
+              <w:rPr>
+                <w:b/>
+                <w:color w:val="FFFFFF"/>
+                <w:sz w:val="20"/>
+              </w:rPr>
+              <w:t>O que foi feito</w:t>
+            </w:r>
+          </w:p>
+        </w:tc>
+      </w:tr>
+      <w:tr>
+        <w:tc>
+          <w:tcPr>
+            <w:tcW w:type="dxa" w:w="2351"/>
+            <w:shd w:val="clear" w:color="auto" w:fill="FFFFFF"/>
+          </w:tcPr>
+          <w:p>
+            <w:pPr>
+              <w:spacing w:after="0"/>
+            </w:pPr>
+            <w:r/>
+            <w:r>
+              <w:rPr>
+                <w:b w:val="0"/>
+                <w:sz w:val="18"/>
+              </w:rPr>
+              <w:t>a30940f</w:t>
+            </w:r>
+          </w:p>
+        </w:tc>
+        <w:tc>
+          <w:tcPr>
+            <w:tcW w:type="dxa" w:w="2351"/>
+            <w:shd w:val="clear" w:color="auto" w:fill="FFFFFF"/>
+          </w:tcPr>
+          <w:p>
+            <w:pPr>
+              <w:spacing w:after="0"/>
+            </w:pPr>
+            <w:r/>
+            <w:r>
+              <w:rPr>
+                <w:b w:val="0"/>
+                <w:sz w:val="18"/>
+              </w:rPr>
+              <w:t>14/08/2026 16:00</w:t>
+              <w:br/>
+              <w:t>José Eduardo (jbr121)</w:t>
+            </w:r>
+          </w:p>
+        </w:tc>
+        <w:tc>
+          <w:tcPr>
+            <w:tcW w:type="dxa" w:w="2351"/>
+            <w:shd w:val="clear" w:color="auto" w:fill="FFFFFF"/>
+          </w:tcPr>
+          <w:p>
+            <w:pPr>
+              <w:spacing w:after="0"/>
+            </w:pPr>
+            <w:r/>
+            <w:r>
+              <w:rPr>
+                <w:b/>
+                <w:sz w:val="18"/>
+              </w:rPr>
+              <w:t>Initial commit: CronotaScan PGI Univali</w:t>
+            </w:r>
+          </w:p>
+        </w:tc>
+        <w:tc>
+          <w:tcPr>
+            <w:tcW w:type="dxa" w:w="2351"/>
+            <w:shd w:val="clear" w:color="auto" w:fill="FFFFFF"/>
+          </w:tcPr>
+          <w:p>
+            <w:pPr>
+              <w:spacing w:after="0"/>
+            </w:pPr>
+            <w:r/>
+            <w:r>
+              <w:rPr>
+                <w:b w:val="0"/>
+                <w:sz w:val="18"/>
+              </w:rPr>
+              <w:t>Estrutura inicial do projeto: FastAPI, banco SQLite, front-end SPA e pipeline básico de leitura.</w:t>
+            </w:r>
+          </w:p>
+        </w:tc>
+      </w:tr>
+      <w:tr>
+        <w:tc>
+          <w:tcPr>
+            <w:tcW w:type="dxa" w:w="2351"/>
+            <w:shd w:val="clear" w:color="auto" w:fill="FFFFFF"/>
+          </w:tcPr>
+          <w:p>
+            <w:pPr>
+              <w:spacing w:after="0"/>
+            </w:pPr>
+            <w:r/>
+            <w:r>
+              <w:rPr>
+                <w:b w:val="0"/>
+                <w:sz w:val="18"/>
+              </w:rPr>
+              <w:t>b6438e2</w:t>
+            </w:r>
+          </w:p>
+        </w:tc>
+        <w:tc>
+          <w:tcPr>
+            <w:tcW w:type="dxa" w:w="2351"/>
+            <w:shd w:val="clear" w:color="auto" w:fill="FFFFFF"/>
+          </w:tcPr>
+          <w:p>
+            <w:pPr>
+              <w:spacing w:after="0"/>
+            </w:pPr>
+            <w:r/>
+            <w:r>
+              <w:rPr>
+                <w:b w:val="0"/>
+                <w:sz w:val="18"/>
+              </w:rPr>
+              <w:t>14/08/2026 16:30</w:t>
+              <w:br/>
+              <w:t>José Eduardo (jbr121)</w:t>
+            </w:r>
+          </w:p>
+        </w:tc>
+        <w:tc>
+          <w:tcPr>
+            <w:tcW w:type="dxa" w:w="2351"/>
+            <w:shd w:val="clear" w:color="auto" w:fill="FFFFFF"/>
+          </w:tcPr>
+          <w:p>
+            <w:pPr>
+              <w:spacing w:after="0"/>
+            </w:pPr>
+            <w:r/>
+            <w:r>
+              <w:rPr>
+                <w:b/>
+                <w:sz w:val="18"/>
+              </w:rPr>
+              <w:t>Add tutorial for running CronotaScan on Univali lab PCs.</w:t>
+            </w:r>
+          </w:p>
+        </w:tc>
+        <w:tc>
+          <w:tcPr>
+            <w:tcW w:type="dxa" w:w="2351"/>
+            <w:shd w:val="clear" w:color="auto" w:fill="FFFFFF"/>
+          </w:tcPr>
+          <w:p>
+            <w:pPr>
+              <w:spacing w:after="0"/>
+            </w:pPr>
+            <w:r/>
+            <w:r>
+              <w:rPr>
+                <w:b w:val="0"/>
+                <w:sz w:val="18"/>
+              </w:rPr>
+              <w:t>Tutorial passo a passo para rodar o sistema nos computadores do laboratório da UNIVALI.</w:t>
+            </w:r>
+          </w:p>
+        </w:tc>
+      </w:tr>
+      <w:tr>
+        <w:tc>
+          <w:tcPr>
+            <w:tcW w:type="dxa" w:w="2351"/>
+            <w:shd w:val="clear" w:color="auto" w:fill="FFFFFF"/>
+          </w:tcPr>
+          <w:p>
+            <w:pPr>
+              <w:spacing w:after="0"/>
+            </w:pPr>
+            <w:r/>
+            <w:r>
+              <w:rPr>
+                <w:b w:val="0"/>
+                <w:sz w:val="18"/>
+              </w:rPr>
+              <w:t>23957bb</w:t>
+            </w:r>
+          </w:p>
+        </w:tc>
+        <w:tc>
+          <w:tcPr>
+            <w:tcW w:type="dxa" w:w="2351"/>
+            <w:shd w:val="clear" w:color="auto" w:fill="FFFFFF"/>
+          </w:tcPr>
+          <w:p>
+            <w:pPr>
+              <w:spacing w:after="0"/>
+            </w:pPr>
+            <w:r/>
+            <w:r>
+              <w:rPr>
+                <w:b w:val="0"/>
+                <w:sz w:val="18"/>
+              </w:rPr>
+              <w:t>14/08/2026 16:32</w:t>
+              <w:br/>
+              <w:t>José Eduardo (jbr121)</w:t>
+            </w:r>
+          </w:p>
+        </w:tc>
+        <w:tc>
+          <w:tcPr>
+            <w:tcW w:type="dxa" w:w="2351"/>
+            <w:shd w:val="clear" w:color="auto" w:fill="FFFFFF"/>
+          </w:tcPr>
+          <w:p>
+            <w:pPr>
+              <w:spacing w:after="0"/>
+            </w:pPr>
+            <w:r/>
+            <w:r>
+              <w:rPr>
+                <w:b/>
+                <w:sz w:val="18"/>
+              </w:rPr>
+              <w:t>Add ES2 complementary documentation without changing existing PGI plan.</w:t>
+            </w:r>
+          </w:p>
+        </w:tc>
+        <w:tc>
+          <w:tcPr>
+            <w:tcW w:type="dxa" w:w="2351"/>
+            <w:shd w:val="clear" w:color="auto" w:fill="FFFFFF"/>
+          </w:tcPr>
+          <w:p>
+            <w:pPr>
+              <w:spacing w:after="0"/>
+            </w:pPr>
+            <w:r/>
+            <w:r>
+              <w:rPr>
+                <w:b w:val="0"/>
+                <w:sz w:val="18"/>
+              </w:rPr>
+              <w:t>Documentação complementar de Engenharia de Software II sem alterar o plano PGI existente.</w:t>
+            </w:r>
+          </w:p>
+        </w:tc>
+      </w:tr>
+      <w:tr>
+        <w:tc>
+          <w:tcPr>
+            <w:tcW w:type="dxa" w:w="2351"/>
+            <w:shd w:val="clear" w:color="auto" w:fill="FFF2CC"/>
+          </w:tcPr>
+          <w:p>
+            <w:pPr>
+              <w:spacing w:after="0"/>
+            </w:pPr>
+            <w:r/>
+            <w:r>
+              <w:rPr>
+                <w:b w:val="0"/>
+                <w:sz w:val="18"/>
+              </w:rPr>
+              <w:t>b3454bb</w:t>
+            </w:r>
+          </w:p>
+        </w:tc>
+        <w:tc>
+          <w:tcPr>
+            <w:tcW w:type="dxa" w:w="2351"/>
+            <w:shd w:val="clear" w:color="auto" w:fill="FFF2CC"/>
+          </w:tcPr>
+          <w:p>
+            <w:pPr>
+              <w:spacing w:after="0"/>
+            </w:pPr>
+            <w:r/>
+            <w:r>
+              <w:rPr>
+                <w:b w:val="0"/>
+                <w:sz w:val="18"/>
+              </w:rPr>
+              <w:t>25/09/2026 20:48</w:t>
+              <w:br/>
+              <w:t>Erick Franzmann Bortoloti + Claude Opus 5.5 (IA)</w:t>
+            </w:r>
+          </w:p>
+        </w:tc>
+        <w:tc>
+          <w:tcPr>
+            <w:tcW w:type="dxa" w:w="2351"/>
+            <w:shd w:val="clear" w:color="auto" w:fill="FFF2CC"/>
+          </w:tcPr>
+          <w:p>
+            <w:pPr>
+              <w:spacing w:after="0"/>
+            </w:pPr>
+            <w:r/>
+            <w:r>
+              <w:rPr>
+                <w:b/>
+                <w:sz w:val="18"/>
+              </w:rPr>
+              <w:t>Integrate v2 disc reader with perspective correction and validation</w:t>
+            </w:r>
+          </w:p>
+        </w:tc>
+        <w:tc>
+          <w:tcPr>
+            <w:tcW w:type="dxa" w:w="2351"/>
+            <w:shd w:val="clear" w:color="auto" w:fill="FFF2CC"/>
+          </w:tcPr>
+          <w:p>
+            <w:pPr>
+              <w:spacing w:after="0"/>
+            </w:pPr>
+            <w:r/>
+            <w:r>
+              <w:rPr>
+                <w:b w:val="0"/>
+                <w:sz w:val="18"/>
+              </w:rPr>
+              <w:t>Reformulação completa do pipeline OpenCV (1125 linhas alteradas): detecção da borda do disco como elipse, homografia para correção de perspectiva (elipse → círculo), orientação pelo arco verde 12h–24h, autocalibração pelos anéis de 20 km/h impressos, leitura da barra de atividade para filtrar minutos parados. Co-Authored-By: Claude Opus 5.5 (Anthropic).</w:t>
+            </w:r>
+          </w:p>
+        </w:tc>
+      </w:tr>
+      <w:tr>
+        <w:tc>
+          <w:tcPr>
+            <w:tcW w:type="dxa" w:w="2351"/>
+            <w:shd w:val="clear" w:color="auto" w:fill="FFF2CC"/>
+          </w:tcPr>
+          <w:p>
+            <w:pPr>
+              <w:spacing w:after="0"/>
+            </w:pPr>
+            <w:r/>
+            <w:r>
+              <w:rPr>
+                <w:b w:val="0"/>
+                <w:sz w:val="18"/>
+              </w:rPr>
+              <w:t>10090b4</w:t>
+            </w:r>
+          </w:p>
+        </w:tc>
+        <w:tc>
+          <w:tcPr>
+            <w:tcW w:type="dxa" w:w="2351"/>
+            <w:shd w:val="clear" w:color="auto" w:fill="FFF2CC"/>
+          </w:tcPr>
+          <w:p>
+            <w:pPr>
+              <w:spacing w:after="0"/>
+            </w:pPr>
+            <w:r/>
+            <w:r>
+              <w:rPr>
+                <w:b w:val="0"/>
+                <w:sz w:val="18"/>
+              </w:rPr>
+              <w:t>09/10/2026 18:46</w:t>
+              <w:br/>
+              <w:t>Cursor Agent (IA) + José Eduardo</w:t>
+            </w:r>
+          </w:p>
+        </w:tc>
+        <w:tc>
+          <w:tcPr>
+            <w:tcW w:type="dxa" w:w="2351"/>
+            <w:shd w:val="clear" w:color="auto" w:fill="FFF2CC"/>
+          </w:tcPr>
+          <w:p>
+            <w:pPr>
+              <w:spacing w:after="0"/>
+            </w:pPr>
+            <w:r/>
+            <w:r>
+              <w:rPr>
+                <w:b/>
+                <w:sz w:val="18"/>
+              </w:rPr>
+              <w:t>Corrige rastreamento da curva do disco</w:t>
+            </w:r>
+          </w:p>
+        </w:tc>
+        <w:tc>
+          <w:tcPr>
+            <w:tcW w:type="dxa" w:w="2351"/>
+            <w:shd w:val="clear" w:color="auto" w:fill="FFF2CC"/>
+          </w:tcPr>
+          <w:p>
+            <w:pPr>
+              <w:spacing w:after="0"/>
+            </w:pPr>
+            <w:r/>
+            <w:r>
+              <w:rPr>
+                <w:b w:val="0"/>
+                <w:sz w:val="18"/>
+              </w:rPr>
+              <w:t>Correção de bugs no rastreamento da agulha de velocidade: ajuste das faixas radiais, remoção de impressão fixa do disco (linhas tracejadas confundidas com agulha) e criação dos primeiros testes unitários automatizados (tests/test_processador_imagem.py, 79 linhas).</w:t>
+            </w:r>
+          </w:p>
+        </w:tc>
+      </w:tr>
+      <w:tr>
+        <w:tc>
+          <w:tcPr>
+            <w:tcW w:type="dxa" w:w="2351"/>
+            <w:shd w:val="clear" w:color="auto" w:fill="FFF2CC"/>
+          </w:tcPr>
+          <w:p>
+            <w:pPr>
+              <w:spacing w:after="0"/>
+            </w:pPr>
+            <w:r/>
+            <w:r>
+              <w:rPr>
+                <w:b w:val="0"/>
+                <w:sz w:val="18"/>
+              </w:rPr>
+              <w:t>634c6db</w:t>
+            </w:r>
+          </w:p>
+        </w:tc>
+        <w:tc>
+          <w:tcPr>
+            <w:tcW w:type="dxa" w:w="2351"/>
+            <w:shd w:val="clear" w:color="auto" w:fill="FFF2CC"/>
+          </w:tcPr>
+          <w:p>
+            <w:pPr>
+              <w:spacing w:after="0"/>
+            </w:pPr>
+            <w:r/>
+            <w:r>
+              <w:rPr>
+                <w:b w:val="0"/>
+                <w:sz w:val="18"/>
+              </w:rPr>
+              <w:t>21/10/2026 11:13</w:t>
+              <w:br/>
+              <w:t>Cursor Agent (IA) + José Eduardo</w:t>
+            </w:r>
+          </w:p>
+        </w:tc>
+        <w:tc>
+          <w:tcPr>
+            <w:tcW w:type="dxa" w:w="2351"/>
+            <w:shd w:val="clear" w:color="auto" w:fill="FFF2CC"/>
+          </w:tcPr>
+          <w:p>
+            <w:pPr>
+              <w:spacing w:after="0"/>
+            </w:pPr>
+            <w:r/>
+            <w:r>
+              <w:rPr>
+                <w:b/>
+                <w:sz w:val="18"/>
+              </w:rPr>
+              <w:t>Calibra a leitura com discos de gabarito conhecido</w:t>
+            </w:r>
+          </w:p>
+        </w:tc>
+        <w:tc>
+          <w:tcPr>
+            <w:tcW w:type="dxa" w:w="2351"/>
+            <w:shd w:val="clear" w:color="auto" w:fill="FFF2CC"/>
+          </w:tcPr>
+          <w:p>
+            <w:pPr>
+              <w:spacing w:after="0"/>
+            </w:pPr>
+            <w:r/>
+            <w:r>
+              <w:rPr>
+                <w:b w:val="0"/>
+                <w:sz w:val="18"/>
+              </w:rPr>
+              <w:t>Calibração com discos reais: zera minutos parados quando a barra de atividade está visível, preserva trechos longos de velocidade constante, reconhece o arco verde mesmo com perspectiva. Adição de fixtures (discos sintéticos reto, inclinado e com lacuna) e testes automatizados com gabarito JSON (tests/test_fixtures_disco.py).</w:t>
+            </w:r>
+          </w:p>
+        </w:tc>
+      </w:tr>
+      <w:tr>
+        <w:tc>
+          <w:tcPr>
+            <w:tcW w:type="dxa" w:w="2351"/>
+            <w:shd w:val="clear" w:color="auto" w:fill="FFF2CC"/>
+          </w:tcPr>
+          <w:p>
+            <w:pPr>
+              <w:spacing w:after="0"/>
+            </w:pPr>
+            <w:r/>
+            <w:r>
+              <w:rPr>
+                <w:b w:val="0"/>
+                <w:sz w:val="18"/>
+              </w:rPr>
+              <w:t>920e257</w:t>
+            </w:r>
+          </w:p>
+        </w:tc>
+        <w:tc>
+          <w:tcPr>
+            <w:tcW w:type="dxa" w:w="2351"/>
+            <w:shd w:val="clear" w:color="auto" w:fill="FFF2CC"/>
+          </w:tcPr>
+          <w:p>
+            <w:pPr>
+              <w:spacing w:after="0"/>
+            </w:pPr>
+            <w:r/>
+            <w:r>
+              <w:rPr>
+                <w:b w:val="0"/>
+                <w:sz w:val="18"/>
+              </w:rPr>
+              <w:t>21/10/2026 11:24</w:t>
+              <w:br/>
+              <w:t>Cursor Agent (IA) + José Eduardo</w:t>
+            </w:r>
+          </w:p>
+        </w:tc>
+        <w:tc>
+          <w:tcPr>
+            <w:tcW w:type="dxa" w:w="2351"/>
+            <w:shd w:val="clear" w:color="auto" w:fill="FFF2CC"/>
+          </w:tcPr>
+          <w:p>
+            <w:pPr>
+              <w:spacing w:after="0"/>
+            </w:pPr>
+            <w:r/>
+            <w:r>
+              <w:rPr>
+                <w:b/>
+                <w:sz w:val="18"/>
+              </w:rPr>
+              <w:t>Gera laudo PDF dos discos de gabarito</w:t>
+            </w:r>
+          </w:p>
+        </w:tc>
+        <w:tc>
+          <w:tcPr>
+            <w:tcW w:type="dxa" w:w="2351"/>
+            <w:shd w:val="clear" w:color="auto" w:fill="FFF2CC"/>
+          </w:tcPr>
+          <w:p>
+            <w:pPr>
+              <w:spacing w:after="0"/>
+            </w:pPr>
+            <w:r/>
+            <w:r>
+              <w:rPr>
+                <w:b w:val="0"/>
+                <w:sz w:val="18"/>
+              </w:rPr>
+              <w:t>Geração do laudo PDF de auditoria com os resultados dos discos de gabarito para validação do pipeline.</w:t>
+            </w:r>
+          </w:p>
+        </w:tc>
+      </w:tr>
+      <w:tr>
+        <w:tc>
+          <w:tcPr>
+            <w:tcW w:type="dxa" w:w="2351"/>
+            <w:shd w:val="clear" w:color="auto" w:fill="FFF2CC"/>
+          </w:tcPr>
+          <w:p>
+            <w:pPr>
+              <w:spacing w:after="0"/>
+            </w:pPr>
+            <w:r/>
+            <w:r>
+              <w:rPr>
+                <w:b w:val="0"/>
+                <w:sz w:val="18"/>
+              </w:rPr>
+              <w:t>b6abd2f</w:t>
+            </w:r>
+          </w:p>
+        </w:tc>
+        <w:tc>
+          <w:tcPr>
+            <w:tcW w:type="dxa" w:w="2351"/>
+            <w:shd w:val="clear" w:color="auto" w:fill="FFF2CC"/>
+          </w:tcPr>
+          <w:p>
+            <w:pPr>
+              <w:spacing w:after="0"/>
+            </w:pPr>
+            <w:r/>
+            <w:r>
+              <w:rPr>
+                <w:b w:val="0"/>
+                <w:sz w:val="18"/>
+              </w:rPr>
+              <w:t>21/10/2026 11:27</w:t>
+              <w:br/>
+              <w:t>Cursor Agent (IA) + José Eduardo</w:t>
+            </w:r>
+          </w:p>
+        </w:tc>
+        <w:tc>
+          <w:tcPr>
+            <w:tcW w:type="dxa" w:w="2351"/>
+            <w:shd w:val="clear" w:color="auto" w:fill="FFF2CC"/>
+          </w:tcPr>
+          <w:p>
+            <w:pPr>
+              <w:spacing w:after="0"/>
+            </w:pPr>
+            <w:r/>
+            <w:r>
+              <w:rPr>
+                <w:b/>
+                <w:sz w:val="18"/>
+              </w:rPr>
+              <w:t>Inclui a interface e o dashboard no laudo PDF</w:t>
+            </w:r>
+          </w:p>
+        </w:tc>
+        <w:tc>
+          <w:tcPr>
+            <w:tcW w:type="dxa" w:w="2351"/>
+            <w:shd w:val="clear" w:color="auto" w:fill="FFF2CC"/>
+          </w:tcPr>
+          <w:p>
+            <w:pPr>
+              <w:spacing w:after="0"/>
+            </w:pPr>
+            <w:r/>
+            <w:r>
+              <w:rPr>
+                <w:b w:val="0"/>
+                <w:sz w:val="18"/>
+              </w:rPr>
+              <w:t>Inserção de capturas de tela da interface web e do dashboard de infrações no laudo PDF para evidência visual.</w:t>
+            </w:r>
+          </w:p>
+        </w:tc>
+      </w:tr>
+      <w:tr>
+        <w:tc>
+          <w:tcPr>
+            <w:tcW w:type="dxa" w:w="2351"/>
+            <w:shd w:val="clear" w:color="auto" w:fill="FFF2CC"/>
+          </w:tcPr>
+          <w:p>
+            <w:pPr>
+              <w:spacing w:after="0"/>
+            </w:pPr>
+            <w:r/>
+            <w:r>
+              <w:rPr>
+                <w:b w:val="0"/>
+                <w:sz w:val="18"/>
+              </w:rPr>
+              <w:t>306196e</w:t>
+            </w:r>
+          </w:p>
+        </w:tc>
+        <w:tc>
+          <w:tcPr>
+            <w:tcW w:type="dxa" w:w="2351"/>
+            <w:shd w:val="clear" w:color="auto" w:fill="FFF2CC"/>
+          </w:tcPr>
+          <w:p>
+            <w:pPr>
+              <w:spacing w:after="0"/>
+            </w:pPr>
+            <w:r/>
+            <w:r>
+              <w:rPr>
+                <w:b w:val="0"/>
+                <w:sz w:val="18"/>
+              </w:rPr>
+              <w:t>21/10/2026 11:39</w:t>
+              <w:br/>
+              <w:t>Cursor Agent (IA) + José Eduardo</w:t>
+            </w:r>
+          </w:p>
+        </w:tc>
+        <w:tc>
+          <w:tcPr>
+            <w:tcW w:type="dxa" w:w="2351"/>
+            <w:shd w:val="clear" w:color="auto" w:fill="FFF2CC"/>
+          </w:tcPr>
+          <w:p>
+            <w:pPr>
+              <w:spacing w:after="0"/>
+            </w:pPr>
+            <w:r/>
+            <w:r>
+              <w:rPr>
+                <w:b/>
+                <w:sz w:val="18"/>
+              </w:rPr>
+              <w:t>Gera o PDF com a explicação das telas e funções</w:t>
+            </w:r>
+          </w:p>
+        </w:tc>
+        <w:tc>
+          <w:tcPr>
+            <w:tcW w:type="dxa" w:w="2351"/>
+            <w:shd w:val="clear" w:color="auto" w:fill="FFF2CC"/>
+          </w:tcPr>
+          <w:p>
+            <w:pPr>
+              <w:spacing w:after="0"/>
+            </w:pPr>
+            <w:r/>
+            <w:r>
+              <w:rPr>
+                <w:b w:val="0"/>
+                <w:sz w:val="18"/>
+              </w:rPr>
+              <w:t>Criação do PDF explicativo de todas as telas e funções do sistema CronotaScan (laudos/explicacao_telas_e_funcoes.pdf).</w:t>
+            </w:r>
+          </w:p>
+        </w:tc>
+      </w:tr>
+      <w:tr>
+        <w:tc>
+          <w:tcPr>
+            <w:tcW w:type="dxa" w:w="2351"/>
+            <w:shd w:val="clear" w:color="auto" w:fill="FFF2CC"/>
+          </w:tcPr>
+          <w:p>
+            <w:pPr>
+              <w:spacing w:after="0"/>
+            </w:pPr>
+            <w:r/>
+            <w:r>
+              <w:rPr>
+                <w:b w:val="0"/>
+                <w:sz w:val="18"/>
+              </w:rPr>
+              <w:t>00aac9a</w:t>
+            </w:r>
+          </w:p>
+        </w:tc>
+        <w:tc>
+          <w:tcPr>
+            <w:tcW w:type="dxa" w:w="2351"/>
+            <w:shd w:val="clear" w:color="auto" w:fill="FFF2CC"/>
+          </w:tcPr>
+          <w:p>
+            <w:pPr>
+              <w:spacing w:after="0"/>
+            </w:pPr>
+            <w:r/>
+            <w:r>
+              <w:rPr>
+                <w:b w:val="0"/>
+                <w:sz w:val="18"/>
+              </w:rPr>
+              <w:t>21/10/2026 11:43</w:t>
+              <w:br/>
+              <w:t>Cursor Agent (IA) + José Eduardo</w:t>
+            </w:r>
+          </w:p>
+        </w:tc>
+        <w:tc>
+          <w:tcPr>
+            <w:tcW w:type="dxa" w:w="2351"/>
+            <w:shd w:val="clear" w:color="auto" w:fill="FFF2CC"/>
+          </w:tcPr>
+          <w:p>
+            <w:pPr>
+              <w:spacing w:after="0"/>
+            </w:pPr>
+            <w:r/>
+            <w:r>
+              <w:rPr>
+                <w:b/>
+                <w:sz w:val="18"/>
+              </w:rPr>
+              <w:t>Adiciona laudo teste com as imagens do CronotaScan</w:t>
+            </w:r>
+          </w:p>
+        </w:tc>
+        <w:tc>
+          <w:tcPr>
+            <w:tcW w:type="dxa" w:w="2351"/>
+            <w:shd w:val="clear" w:color="auto" w:fill="FFF2CC"/>
+          </w:tcPr>
+          <w:p>
+            <w:pPr>
+              <w:spacing w:after="0"/>
+            </w:pPr>
+            <w:r/>
+            <w:r>
+              <w:rPr>
+                <w:b w:val="0"/>
+                <w:sz w:val="18"/>
+              </w:rPr>
+              <w:t>Laudo de teste completo com imagens do sistema incluídas para apresentação à professora (laudos/laudo_teste.pdf).</w:t>
+            </w:r>
+          </w:p>
+        </w:tc>
+      </w:tr>
+      <w:tr>
+        <w:tc>
+          <w:tcPr>
+            <w:tcW w:type="dxa" w:w="2351"/>
+            <w:shd w:val="clear" w:color="auto" w:fill="FFF2CC"/>
+          </w:tcPr>
+          <w:p>
+            <w:pPr>
+              <w:spacing w:after="0"/>
+            </w:pPr>
+            <w:r/>
+            <w:r>
+              <w:rPr>
+                <w:b w:val="0"/>
+                <w:sz w:val="18"/>
+              </w:rPr>
+              <w:t>8b438ca</w:t>
+            </w:r>
+          </w:p>
+        </w:tc>
+        <w:tc>
+          <w:tcPr>
+            <w:tcW w:type="dxa" w:w="2351"/>
+            <w:shd w:val="clear" w:color="auto" w:fill="FFF2CC"/>
+          </w:tcPr>
+          <w:p>
+            <w:pPr>
+              <w:spacing w:after="0"/>
+            </w:pPr>
+            <w:r/>
+            <w:r>
+              <w:rPr>
+                <w:b w:val="0"/>
+                <w:sz w:val="18"/>
+              </w:rPr>
+              <w:t>21/10/2026 11:49</w:t>
+              <w:br/>
+              <w:t>Cursor Agent (IA) + José Eduardo</w:t>
+            </w:r>
+          </w:p>
+        </w:tc>
+        <w:tc>
+          <w:tcPr>
+            <w:tcW w:type="dxa" w:w="2351"/>
+            <w:shd w:val="clear" w:color="auto" w:fill="FFF2CC"/>
+          </w:tcPr>
+          <w:p>
+            <w:pPr>
+              <w:spacing w:after="0"/>
+            </w:pPr>
+            <w:r/>
+            <w:r>
+              <w:rPr>
+                <w:b/>
+                <w:sz w:val="18"/>
+              </w:rPr>
+              <w:t>Reescreve o laudo teste com a explicação de cada tela e função</w:t>
+            </w:r>
+          </w:p>
+        </w:tc>
+        <w:tc>
+          <w:tcPr>
+            <w:tcW w:type="dxa" w:w="2351"/>
+            <w:shd w:val="clear" w:color="auto" w:fill="FFF2CC"/>
+          </w:tcPr>
+          <w:p>
+            <w:pPr>
+              <w:spacing w:after="0"/>
+            </w:pPr>
+            <w:r/>
+            <w:r>
+              <w:rPr>
+                <w:b w:val="0"/>
+                <w:sz w:val="18"/>
+              </w:rPr>
+              <w:t>Revisão completa do laudo de teste: cada tela e função do sistema descrita individualmente com clareza para a banca.</w:t>
+            </w:r>
+          </w:p>
+        </w:tc>
+      </w:tr>
+      <w:tr>
+        <w:tc>
+          <w:tcPr>
+            <w:tcW w:type="dxa" w:w="2351"/>
+            <w:shd w:val="clear" w:color="auto" w:fill="FFFFFF"/>
+          </w:tcPr>
+          <w:p>
+            <w:pPr>
+              <w:spacing w:after="0"/>
+            </w:pPr>
+            <w:r/>
+            <w:r>
+              <w:rPr>
+                <w:b w:val="0"/>
+                <w:sz w:val="18"/>
+              </w:rPr>
+              <w:t>9842a38</w:t>
+            </w:r>
+          </w:p>
+        </w:tc>
+        <w:tc>
+          <w:tcPr>
+            <w:tcW w:type="dxa" w:w="2351"/>
+            <w:shd w:val="clear" w:color="auto" w:fill="FFFFFF"/>
+          </w:tcPr>
+          <w:p>
+            <w:pPr>
+              <w:spacing w:after="0"/>
+            </w:pPr>
+            <w:r/>
+            <w:r>
+              <w:rPr>
+                <w:b w:val="0"/>
+                <w:sz w:val="18"/>
+              </w:rPr>
+              <w:t>23/10/2026 09:17</w:t>
+              <w:br/>
+              <w:t>José Eduardo (jbr121)</w:t>
+            </w:r>
+          </w:p>
+        </w:tc>
+        <w:tc>
+          <w:tcPr>
+            <w:tcW w:type="dxa" w:w="2351"/>
+            <w:shd w:val="clear" w:color="auto" w:fill="FFFFFF"/>
+          </w:tcPr>
+          <w:p>
+            <w:pPr>
+              <w:spacing w:after="0"/>
+            </w:pPr>
+            <w:r/>
+            <w:r>
+              <w:rPr>
+                <w:b/>
+                <w:sz w:val="18"/>
+              </w:rPr>
+              <w:t>Cursor: Apply local changes for cloud agent</w:t>
+            </w:r>
+          </w:p>
+        </w:tc>
+        <w:tc>
+          <w:tcPr>
+            <w:tcW w:type="dxa" w:w="2351"/>
+            <w:shd w:val="clear" w:color="auto" w:fill="FFFFFF"/>
+          </w:tcPr>
+          <w:p>
+            <w:pPr>
+              <w:spacing w:after="0"/>
+            </w:pPr>
+            <w:r/>
+            <w:r>
+              <w:rPr>
+                <w:b w:val="0"/>
+                <w:sz w:val="18"/>
+              </w:rPr>
+              <w:t>Sincronização de alterações locais com o agente na nuvem do Cursor.</w:t>
+            </w:r>
+          </w:p>
+        </w:tc>
+      </w:tr>
+      <w:tr>
+        <w:tc>
+          <w:tcPr>
+            <w:tcW w:type="dxa" w:w="2351"/>
+            <w:shd w:val="clear" w:color="auto" w:fill="FFF2CC"/>
+          </w:tcPr>
+          <w:p>
+            <w:pPr>
+              <w:spacing w:after="0"/>
+            </w:pPr>
+            <w:r/>
+            <w:r>
+              <w:rPr>
+                <w:b w:val="0"/>
+                <w:sz w:val="18"/>
+              </w:rPr>
+              <w:t>e72dcc8</w:t>
+            </w:r>
+          </w:p>
+        </w:tc>
+        <w:tc>
+          <w:tcPr>
+            <w:tcW w:type="dxa" w:w="2351"/>
+            <w:shd w:val="clear" w:color="auto" w:fill="FFF2CC"/>
+          </w:tcPr>
+          <w:p>
+            <w:pPr>
+              <w:spacing w:after="0"/>
+            </w:pPr>
+            <w:r/>
+            <w:r>
+              <w:rPr>
+                <w:b w:val="0"/>
+                <w:sz w:val="18"/>
+              </w:rPr>
+              <w:t>23/10/2026 12:20</w:t>
+              <w:br/>
+              <w:t>Cursor Agent (IA)</w:t>
+            </w:r>
+          </w:p>
+        </w:tc>
+        <w:tc>
+          <w:tcPr>
+            <w:tcW w:type="dxa" w:w="2351"/>
+            <w:shd w:val="clear" w:color="auto" w:fill="FFF2CC"/>
+          </w:tcPr>
+          <w:p>
+            <w:pPr>
+              <w:spacing w:after="0"/>
+            </w:pPr>
+            <w:r/>
+            <w:r>
+              <w:rPr>
+                <w:b/>
+                <w:sz w:val="18"/>
+              </w:rPr>
+              <w:t>docs: adiciona documento de declaração de uso de IA (para entrega M2)</w:t>
+            </w:r>
+          </w:p>
+        </w:tc>
+        <w:tc>
+          <w:tcPr>
+            <w:tcW w:type="dxa" w:w="2351"/>
+            <w:shd w:val="clear" w:color="auto" w:fill="FFF2CC"/>
+          </w:tcPr>
+          <w:p>
+            <w:pPr>
+              <w:spacing w:after="0"/>
+            </w:pPr>
+            <w:r/>
+            <w:r>
+              <w:rPr>
+                <w:b w:val="0"/>
+                <w:sz w:val="18"/>
+              </w:rPr>
+              <w:t>Criação deste próprio documento de declaração de uso de IA, conforme solicitado pela professora.</w:t>
+            </w:r>
+          </w:p>
+        </w:tc>
+      </w:tr>
+    </w:tbl>
+    <w:p/>
+    <w:p>
+      <w:r>
+        <w:rPr>
+          <w:b/>
+          <w:sz w:val="20"/>
+        </w:rPr>
+        <w:t xml:space="preserve">Legenda: </w:t>
+      </w:r>
+      <w:r>
+        <w:rPr>
+          <w:sz w:val="20"/>
+        </w:rPr>
+        <w:t xml:space="preserve">Fundo </w:t>
+      </w:r>
+      <w:r>
+        <w:rPr>
+          <w:b/>
+          <w:sz w:val="20"/>
+        </w:rPr>
+        <w:t>amarelo</w:t>
+      </w:r>
+      <w:r>
+        <w:rPr>
+          <w:sz w:val="20"/>
+        </w:rPr>
+        <w:t xml:space="preserve"> = commit com auxílio de IA.  Fundo </w:t>
+      </w:r>
+      <w:r>
+        <w:rPr>
+          <w:b/>
+          <w:sz w:val="20"/>
+        </w:rPr>
+        <w:t>branco</w:t>
+      </w:r>
+      <w:r>
+        <w:rPr>
+          <w:sz w:val="20"/>
+        </w:rPr>
+        <w:t xml:space="preserve"> = commit somente da equipe.</w:t>
+      </w:r>
+    </w:p>
+    <w:p/>
+    <w:p>
+      <w:pPr>
+        <w:pStyle w:val="Heading2"/>
+        <w:spacing w:before="280" w:after="120"/>
+      </w:pPr>
+      <w:r>
+        <w:t>4. Detalhamento do Uso de IA por Área do Projeto</w:t>
       </w:r>
     </w:p>
     <w:p>
@@ -105,7 +1414,7 @@
         <w:pStyle w:val="Heading3"/>
       </w:pPr>
       <w:r>
-        <w:t>3.1 Pipeline de Visão Computacional (core/processador_imagem.py)</w:t>
+        <w:t>4.1 Pipeline de Visão Computacional (core/processador_imagem.py)</w:t>
       </w:r>
     </w:p>
     <w:p>
@@ -130,18 +1439,6 @@
         <w:rPr>
           <w:sz w:val="24"/>
         </w:rPr>
-        <w:t>Sugerir o uso de cv2.warpPolar para o desdobramento polar do disco.</w:t>
-      </w:r>
-    </w:p>
-    <w:p>
-      <w:pPr>
-        <w:pStyle w:val="ListBullet"/>
-        <w:spacing w:after="80"/>
-      </w:pPr>
-      <w:r>
-        <w:rPr>
-          <w:sz w:val="24"/>
-        </w:rPr>
         <w:t>Propor o uso de cv2.fitEllipse para detectar a borda do disco mesmo em fotos inclinadas.</w:t>
       </w:r>
     </w:p>
@@ -154,7 +1451,7 @@
         <w:rPr>
           <w:sz w:val="24"/>
         </w:rPr>
-        <w:t>Auxiliar na lógica de homografia (correção de perspectiva elipse → círculo).</w:t>
+        <w:t>Desenvolver a homografia que corrige a perspectiva da foto (elipse → círculo perfeito).</w:t>
       </w:r>
     </w:p>
     <w:p>
@@ -166,7 +1463,7 @@
         <w:rPr>
           <w:sz w:val="24"/>
         </w:rPr>
-        <w:t>Sugerir o uso de máscara HSV para isolar o papel branco do disco e ignorar o mousepad colorido de fundo.</w:t>
+        <w:t>Sugerir cv2.warpPolar para o desdobramento polar (disco circular → imagem retangular).</w:t>
       </w:r>
     </w:p>
     <w:p>
@@ -178,7 +1475,43 @@
         <w:rPr>
           <w:sz w:val="24"/>
         </w:rPr>
-        <w:t>Depurar erros de detecção falsa de velocidade causados pelo resíduo da grade impressa.</w:t>
+        <w:t>Criar a lógica de máscara HSV para isolar o papel branco do disco e ignorar o mousepad colorido de fundo.</w:t>
+      </w:r>
+    </w:p>
+    <w:p>
+      <w:pPr>
+        <w:pStyle w:val="ListBullet"/>
+        <w:spacing w:after="80"/>
+      </w:pPr>
+      <w:r>
+        <w:rPr>
+          <w:sz w:val="24"/>
+        </w:rPr>
+        <w:t>Implementar a autocalibração pelos anéis tracejados impressos (20, 40, 60, 80, 100 km/h).</w:t>
+      </w:r>
+    </w:p>
+    <w:p>
+      <w:pPr>
+        <w:pStyle w:val="ListBullet"/>
+        <w:spacing w:after="80"/>
+      </w:pPr>
+      <w:r>
+        <w:rPr>
+          <w:sz w:val="24"/>
+        </w:rPr>
+        <w:t>Criar a detecção da barra de atividade para ler velocidade somente nos minutos em que o caminhão está em movimento.</w:t>
+      </w:r>
+    </w:p>
+    <w:p>
+      <w:pPr>
+        <w:pStyle w:val="ListBullet"/>
+        <w:spacing w:after="80"/>
+      </w:pPr>
+      <w:r>
+        <w:rPr>
+          <w:sz w:val="24"/>
+        </w:rPr>
+        <w:t>Implementar a orientação pelo arco verde 12h–24h impresso na borda do disco.</w:t>
       </w:r>
     </w:p>
     <w:p>
@@ -191,7 +1524,7 @@
           <w:b w:val="0"/>
           <w:sz w:val="24"/>
         </w:rPr>
-        <w:t>Em todos esses casos, a equipe revisou o código gerado, ajustou os parâmetros com base nas fotos reais dos discos (ex.: faixas HSV do verde impresso, raios fracionários da escala de velocidade) e validou os resultados manualmente.</w:t>
+        <w:t>Commits relacionados: b3454bb (25/09/2026), 10090b4 (09/10/2026), 634c6db (21/10/2026). Em todos, a equipe revisou o código gerado, ajustou os parâmetros com fotos reais dos discos e validou os resultados manualmente.</w:t>
       </w:r>
     </w:p>
     <w:p>
@@ -199,7 +1532,7 @@
         <w:pStyle w:val="Heading3"/>
       </w:pPr>
       <w:r>
-        <w:t>3.2 Detecção e Correção de Bugs</w:t>
+        <w:t>4.2 Testes Automatizados</w:t>
       </w:r>
     </w:p>
     <w:p>
@@ -212,7 +1545,7 @@
           <w:b w:val="0"/>
           <w:sz w:val="24"/>
         </w:rPr>
-        <w:t>Durante o desenvolvimento, vários bugs foram identificados com o auxílio da IA:</w:t>
+        <w:t>Os testes unitários e de fixtures foram elaborados com suporte da IA:</w:t>
       </w:r>
     </w:p>
     <w:p>
@@ -224,7 +1557,7 @@
         <w:rPr>
           <w:sz w:val="24"/>
         </w:rPr>
-        <w:t>Bug de fase: a madrugada parada era exibida como período de movimento — corrigido pela IA ao propor o uso da curva de velocidade extraída como score de orientação, em vez da máscara de atividade crua.</w:t>
+        <w:t>tests/test_processador_imagem.py — testes do pipeline principal (commit 10090b4).</w:t>
       </w:r>
     </w:p>
     <w:p>
@@ -236,7 +1569,7 @@
         <w:rPr>
           <w:sz w:val="24"/>
         </w:rPr>
-        <w:t>Bug do mousepad: o fundo azul/escuro da mesa era detectado como o disco — corrigido com máscara de brancura (brilho − saturação) em vez de Hough simples.</w:t>
+        <w:t>tests/discos_sinteticos.py — geração de discos sintéticos com OpenCV (reto, inclinado, com lacuna).</w:t>
       </w:r>
     </w:p>
     <w:p>
@@ -248,15 +1581,7 @@
         <w:rPr>
           <w:sz w:val="24"/>
         </w:rPr>
-        <w:t>Contagem excessiva de quilômetros: a IA identificou que o zigue-zague do odômetro estava contando ruído e sugeriu filtro de distância mínima entre cruzamentos.</w:t>
-      </w:r>
-    </w:p>
-    <w:p>
-      <w:pPr>
-        <w:pStyle w:val="Heading3"/>
-      </w:pPr>
-      <w:r>
-        <w:t>3.3 Testes Unitários (tests/test_pipeline.py)</w:t>
+        <w:t>tests/test_fixtures_disco.py — comparação de resultados com gabarito JSON (commit 634c6db).</w:t>
       </w:r>
     </w:p>
     <w:p>
@@ -269,7 +1594,7 @@
           <w:b w:val="0"/>
           <w:sz w:val="24"/>
         </w:rPr>
-        <w:t>Os 14 testes sintéticos do arquivo test_pipeline.py foram elaborados com suporte da IA, que gerou discos sintéticos com OpenCV para simular cenários como: fundo preto, mousepad azul, disco inclinado, madrugada parada e saltos irrealistas de velocidade. A equipe definiu os cenários e os critérios de aceite; a IA traduziu esses cenários em código de teste.</w:t>
+        <w:t>A equipe definiu os cenários e critérios de aceite; a IA traduziu esses cenários em código.</w:t>
       </w:r>
     </w:p>
     <w:p>
@@ -277,7 +1602,51 @@
         <w:pStyle w:val="Heading3"/>
       </w:pPr>
       <w:r>
-        <w:t>3.4 Documentação Acadêmica</w:t>
+        <w:t>4.3 Laudos e PDFs</w:t>
+      </w:r>
+    </w:p>
+    <w:p>
+      <w:pPr>
+        <w:pStyle w:val="ListBullet"/>
+        <w:spacing w:after="80"/>
+      </w:pPr>
+      <w:r>
+        <w:rPr>
+          <w:sz w:val="24"/>
+        </w:rPr>
+        <w:t>laudos/laudo_discos_gabarito.pdf — laudo dos discos de gabarito (commit 920e257).</w:t>
+      </w:r>
+    </w:p>
+    <w:p>
+      <w:pPr>
+        <w:pStyle w:val="ListBullet"/>
+        <w:spacing w:after="80"/>
+      </w:pPr>
+      <w:r>
+        <w:rPr>
+          <w:sz w:val="24"/>
+        </w:rPr>
+        <w:t>laudos/explicacao_telas_e_funcoes.pdf — PDF com todas as telas e funções (commit 306196e).</w:t>
+      </w:r>
+    </w:p>
+    <w:p>
+      <w:pPr>
+        <w:pStyle w:val="ListBullet"/>
+        <w:spacing w:after="80"/>
+      </w:pPr>
+      <w:r>
+        <w:rPr>
+          <w:sz w:val="24"/>
+        </w:rPr>
+        <w:t>laudos/laudo_teste.pdf — laudo completo com imagens do sistema (commits 00aac9a e 8b438ca).</w:t>
+      </w:r>
+    </w:p>
+    <w:p>
+      <w:pPr>
+        <w:pStyle w:val="Heading3"/>
+      </w:pPr>
+      <w:r>
+        <w:t>4.4 Documentação Acadêmica</w:t>
       </w:r>
     </w:p>
     <w:p>
@@ -290,7 +1659,7 @@
           <w:b w:val="0"/>
           <w:sz w:val="24"/>
         </w:rPr>
-        <w:t>A IA auxiliou na redação e formatação dos seguintes documentos entregues na disciplina de Engenharia de Software II:</w:t>
+        <w:t>A IA auxiliou na redação e formatação dos seguintes documentos entregues na disciplina:</w:t>
       </w:r>
     </w:p>
     <w:p>
@@ -302,7 +1671,7 @@
         <w:rPr>
           <w:sz w:val="24"/>
         </w:rPr>
-        <w:t>M1 — Visão, Arquitetura e Planejamento do CronotaScan (Word + diagramas UML).</w:t>
+        <w:t>M1 — Visão, Arquitetura e Planejamento do CronotaScan (Word + diagramas UML em PNG).</w:t>
       </w:r>
     </w:p>
     <w:p>
@@ -314,7 +1683,7 @@
         <w:rPr>
           <w:sz w:val="24"/>
         </w:rPr>
-        <w:t>Lean Inception — Visão do produto, É/Não é/Faz/Não faz e objetivos principais.</w:t>
+        <w:t>Lean Inception — Visão do produto, É/Não é / Faz/Não faz e 3 objetivos principais.</w:t>
       </w:r>
     </w:p>
     <w:p>
@@ -338,7 +1707,7 @@
         <w:rPr>
           <w:sz w:val="24"/>
         </w:rPr>
-        <w:t>Atividade de Testes (partes 1 e 2) — respostas às questões teóricas sobre testes de software.</w:t>
+        <w:t>Atividade de Testes (partes 1 e 2) — respostas às questões teóricas em linguagem simples.</w:t>
       </w:r>
     </w:p>
     <w:p>
@@ -350,63 +1719,28 @@
         <w:rPr>
           <w:sz w:val="24"/>
         </w:rPr>
-        <w:t>M2 — Relatório de progresso, roteiro de apresentação e print das telas.</w:t>
+        <w:t>M2 — Relatório de progresso e roteiro de apresentação oral.</w:t>
       </w:r>
     </w:p>
     <w:p>
       <w:pPr>
-        <w:spacing w:after="120"/>
-        <w:jc w:val="both"/>
+        <w:pStyle w:val="ListBullet"/>
+        <w:spacing w:after="80"/>
       </w:pPr>
       <w:r>
         <w:rPr>
-          <w:b w:val="0"/>
           <w:sz w:val="24"/>
         </w:rPr>
-        <w:t>Em todos os casos, a equipe forneceu os dados reais do projeto (arquivos Python, telas da aplicação, nomes dos integrantes) e a IA organizou o conteúdo no formato solicitado pela professora. O texto foi revisado e aprovado pelo grupo antes da entrega.</w:t>
-      </w:r>
-    </w:p>
-    <w:p>
-      <w:pPr>
-        <w:pStyle w:val="Heading3"/>
-      </w:pPr>
-      <w:r>
-        <w:t>3.5 Análise e Depuração de Desempenho</w:t>
-      </w:r>
-    </w:p>
-    <w:p>
-      <w:pPr>
-        <w:spacing w:after="120"/>
-        <w:jc w:val="both"/>
-      </w:pPr>
-      <w:r>
-        <w:rPr>
-          <w:b w:val="0"/>
-          <w:sz w:val="24"/>
-        </w:rPr>
-        <w:t>A IA foi consultada para analisar gargalos de desempenho, como a função _endireitar_grade_no_linear que levava 20 segundos por imagem usando cross-correlação pixel a pixel. A IA propôs substituir o algoritmo O(W×H×shifts) por centroide por coluna O(W×H), reduzindo o tempo para menos de 1 segundo.</w:t>
+        <w:t>Este documento — Declaração de Uso de IA (commit e72dcc8, 23/10/2026).</w:t>
       </w:r>
     </w:p>
     <w:p>
       <w:pPr>
         <w:pStyle w:val="Heading2"/>
-        <w:spacing w:before="240" w:after="120"/>
+        <w:spacing w:before="280" w:after="120"/>
       </w:pPr>
       <w:r>
-        <w:t>4. O Que NÃO Foi Feito pela IA</w:t>
-      </w:r>
-    </w:p>
-    <w:p>
-      <w:pPr>
-        <w:spacing w:after="120"/>
-        <w:jc w:val="both"/>
-      </w:pPr>
-      <w:r>
-        <w:rPr>
-          <w:b w:val="0"/>
-          <w:sz w:val="24"/>
-        </w:rPr>
-        <w:t>Para clareza e integridade acadêmica, listamos abaixo as atividades que foram realizadas integralmente pela equipe, sem suporte de IA:</w:t>
+        <w:t>5. O Que NÃO Foi Feito pela IA</w:t>
       </w:r>
     </w:p>
     <w:p>
@@ -430,7 +1764,7 @@
         <w:rPr>
           <w:sz w:val="24"/>
         </w:rPr>
-        <w:t>Definição dos requisitos funcionais do sistema junto ao orientador/professor.</w:t>
+        <w:t>Definição dos requisitos funcionais junto ao orientador/professor.</w:t>
       </w:r>
     </w:p>
     <w:p>
@@ -442,7 +1776,19 @@
         <w:rPr>
           <w:sz w:val="24"/>
         </w:rPr>
-        <w:t>Validação dos resultados do pipeline contra laudos reais (comparação manual dos valores de km e velocidade).</w:t>
+        <w:t>Validação dos resultados do pipeline contra laudos reais (comparação manual de km e velocidade).</w:t>
+      </w:r>
+    </w:p>
+    <w:p>
+      <w:pPr>
+        <w:pStyle w:val="ListBullet"/>
+        <w:spacing w:after="80"/>
+      </w:pPr>
+      <w:r>
+        <w:rPr>
+          <w:sz w:val="24"/>
+        </w:rPr>
+        <w:t>Decisões de arquitetura: escolha de FastAPI, SQLite, SPA HTML/JS puro.</w:t>
       </w:r>
     </w:p>
     <w:p>
@@ -466,16 +1812,189 @@
         <w:rPr>
           <w:sz w:val="24"/>
         </w:rPr>
-        <w:t>Decisões de arquitetura (escolha de FastAPI, SQLite, SPA HTML/JS puro).</w:t>
+        <w:t>Estrutura inicial do projeto (commit a30940f — Initial commit, feito exclusivamente pela equipe).</w:t>
       </w:r>
     </w:p>
     <w:p>
       <w:pPr>
         <w:pStyle w:val="Heading2"/>
-        <w:spacing w:before="240" w:after="120"/>
+        <w:spacing w:before="280" w:after="120"/>
       </w:pPr>
       <w:r>
-        <w:t>5. Considerações Finais</w:t>
+        <w:t>6. Resumo Estatístico</w:t>
+      </w:r>
+    </w:p>
+    <w:tbl>
+      <w:tblPr>
+        <w:tblStyle w:val="TableGrid"/>
+        <w:tblW w:type="auto" w:w="0"/>
+        <w:tblLook w:firstColumn="1" w:firstRow="1" w:lastColumn="0" w:lastRow="0" w:noHBand="0" w:noVBand="1" w:val="04A0"/>
+      </w:tblPr>
+      <w:tblGrid>
+        <w:gridCol w:w="4702"/>
+        <w:gridCol w:w="4702"/>
+      </w:tblGrid>
+      <w:tr>
+        <w:tc>
+          <w:tcPr>
+            <w:tcW w:type="dxa" w:w="4702"/>
+          </w:tcPr>
+          <w:p>
+            <w:pPr>
+              <w:spacing w:after="0"/>
+            </w:pPr>
+            <w:r/>
+            <w:r>
+              <w:rPr>
+                <w:b/>
+                <w:sz w:val="22"/>
+              </w:rPr>
+              <w:t>Total de commits no repositório</w:t>
+            </w:r>
+          </w:p>
+        </w:tc>
+        <w:tc>
+          <w:tcPr>
+            <w:tcW w:type="dxa" w:w="4702"/>
+          </w:tcPr>
+          <w:p>
+            <w:pPr>
+              <w:spacing w:after="0"/>
+            </w:pPr>
+            <w:r/>
+            <w:r>
+              <w:rPr>
+                <w:b w:val="0"/>
+                <w:sz w:val="22"/>
+              </w:rPr>
+              <w:t>13</w:t>
+            </w:r>
+          </w:p>
+        </w:tc>
+      </w:tr>
+      <w:tr>
+        <w:tc>
+          <w:tcPr>
+            <w:tcW w:type="dxa" w:w="4702"/>
+          </w:tcPr>
+          <w:p>
+            <w:pPr>
+              <w:spacing w:after="0"/>
+            </w:pPr>
+            <w:r/>
+            <w:r>
+              <w:rPr>
+                <w:b/>
+                <w:sz w:val="22"/>
+              </w:rPr>
+              <w:t>Commits com auxílio de IA (fundo amarelo)</w:t>
+            </w:r>
+          </w:p>
+        </w:tc>
+        <w:tc>
+          <w:tcPr>
+            <w:tcW w:type="dxa" w:w="4702"/>
+          </w:tcPr>
+          <w:p>
+            <w:pPr>
+              <w:spacing w:after="0"/>
+            </w:pPr>
+            <w:r/>
+            <w:r>
+              <w:rPr>
+                <w:b w:val="0"/>
+                <w:sz w:val="22"/>
+              </w:rPr>
+              <w:t>9</w:t>
+            </w:r>
+          </w:p>
+        </w:tc>
+      </w:tr>
+      <w:tr>
+        <w:tc>
+          <w:tcPr>
+            <w:tcW w:type="dxa" w:w="4702"/>
+          </w:tcPr>
+          <w:p>
+            <w:pPr>
+              <w:spacing w:after="0"/>
+            </w:pPr>
+            <w:r/>
+            <w:r>
+              <w:rPr>
+                <w:b/>
+                <w:sz w:val="22"/>
+              </w:rPr>
+              <w:t>Commits somente da equipe (fundo branco)</w:t>
+            </w:r>
+          </w:p>
+        </w:tc>
+        <w:tc>
+          <w:tcPr>
+            <w:tcW w:type="dxa" w:w="4702"/>
+          </w:tcPr>
+          <w:p>
+            <w:pPr>
+              <w:spacing w:after="0"/>
+            </w:pPr>
+            <w:r/>
+            <w:r>
+              <w:rPr>
+                <w:b w:val="0"/>
+                <w:sz w:val="22"/>
+              </w:rPr>
+              <w:t>4</w:t>
+            </w:r>
+          </w:p>
+        </w:tc>
+      </w:tr>
+      <w:tr>
+        <w:tc>
+          <w:tcPr>
+            <w:tcW w:type="dxa" w:w="4702"/>
+          </w:tcPr>
+          <w:p>
+            <w:pPr>
+              <w:spacing w:after="0"/>
+            </w:pPr>
+            <w:r/>
+            <w:r>
+              <w:rPr>
+                <w:b/>
+                <w:sz w:val="22"/>
+              </w:rPr>
+              <w:t>Repositório GitHub</w:t>
+            </w:r>
+          </w:p>
+        </w:tc>
+        <w:tc>
+          <w:tcPr>
+            <w:tcW w:type="dxa" w:w="4702"/>
+          </w:tcPr>
+          <w:p>
+            <w:pPr>
+              <w:spacing w:after="0"/>
+            </w:pPr>
+            <w:r/>
+            <w:r>
+              <w:rPr>
+                <w:b w:val="0"/>
+                <w:sz w:val="22"/>
+              </w:rPr>
+              <w:t>https://github.com/jbr121/CRONOTACOGRAFOS</w:t>
+            </w:r>
+          </w:p>
+        </w:tc>
+      </w:tr>
+    </w:tbl>
+    <w:p/>
+    <w:p>
+      <w:pPr>
+        <w:pStyle w:val="Heading2"/>
+        <w:spacing w:before="280" w:after="120"/>
+      </w:pPr>
+      <w:r>
+        <w:t>7. Declaração e Assinaturas</w:t>
       </w:r>
     </w:p>
     <w:p>
@@ -488,12 +2007,64 @@
           <w:b w:val="0"/>
           <w:sz w:val="24"/>
         </w:rPr>
-        <w:t>O uso de IA generativa no projeto CronotaScan foi transparente, supervisionado e complementar ao trabalho da equipe. A ferramenta funcionou como um assistente de programação avançado: acelerou a escrita de código repetitivo, sugeriu abordagens algorítmicas e ajudou a formatar documentos, mas todas as decisões técnicas e acadêmicas relevantes foram tomadas pelos integrantes do grupo. A equipe se responsabiliza integralmente pelo conteúdo entregue.</w:t>
+        <w:t>Os abaixo assinados declaram que as informações acima são verdadeiras e que o uso da IA foi realizado de forma ética, transparente e sob supervisão da equipe, em conformidade com as diretrizes da UNIVALI para projetos integradores.</w:t>
       </w:r>
     </w:p>
+    <w:p/>
+    <w:p>
+      <w:r>
+        <w:rPr>
+          <w:sz w:val="22"/>
+        </w:rPr>
+        <w:t>_______________________________________________________</w:t>
+      </w:r>
+    </w:p>
+    <w:p>
+      <w:r>
+        <w:rPr>
+          <w:sz w:val="22"/>
+        </w:rPr>
+        <w:t>José Eduardo</w:t>
+      </w:r>
+    </w:p>
+    <w:p/>
+    <w:p>
+      <w:r>
+        <w:rPr>
+          <w:sz w:val="22"/>
+        </w:rPr>
+        <w:t>_______________________________________________________</w:t>
+      </w:r>
+    </w:p>
+    <w:p>
+      <w:r>
+        <w:rPr>
+          <w:sz w:val="22"/>
+        </w:rPr>
+        <w:t>Márcio Fossa</w:t>
+      </w:r>
+    </w:p>
+    <w:p/>
+    <w:p>
+      <w:r>
+        <w:rPr>
+          <w:sz w:val="22"/>
+        </w:rPr>
+        <w:t>_______________________________________________________</w:t>
+      </w:r>
+    </w:p>
+    <w:p>
+      <w:r>
+        <w:rPr>
+          <w:sz w:val="22"/>
+        </w:rPr>
+        <w:t>Erick Franzmann Bortoloti</w:t>
+      </w:r>
+    </w:p>
+    <w:p/>
     <w:sectPr>
       <w:pgSz w:w="12240" w:h="15840"/>
-      <w:pgMar w:top="1700" w:right="1140" w:bottom="1140" w:left="1700" w:header="720" w:footer="720" w:gutter="0"/>
+      <w:pgMar w:top="1701" w:right="1134" w:bottom="1134" w:left="1701" w:header="720" w:footer="720" w:gutter="0"/>
       <w:cols w:space="720"/>
       <w:docGrid w:linePitch="360"/>
     </w:sectPr>

</xml_diff>

<commit_message>
docs: corrige datas, branches e classificação de IA na declaração
Co-authored-by: José Eduardo <jbr121@users.noreply.github.com>
</commit_message>
<xml_diff>
--- a/docs/CronotaScan_Uso_de_IA.docx
+++ b/docs/CronotaScan_Uso_de_IA.docx
@@ -5,7 +5,6 @@
     <w:p>
       <w:pPr>
         <w:pStyle w:val="Title"/>
-        <w:spacing w:after="80"/>
         <w:jc w:val="center"/>
       </w:pPr>
       <w:r>
@@ -19,6 +18,7 @@
       </w:pPr>
       <w:r>
         <w:rPr>
+          <w:rFonts w:ascii="Times New Roman" w:hAnsi="Times New Roman"/>
           <w:b/>
           <w:sz w:val="24"/>
         </w:rPr>
@@ -32,6 +32,7 @@
       </w:pPr>
       <w:r>
         <w:rPr>
+          <w:rFonts w:ascii="Times New Roman" w:hAnsi="Times New Roman"/>
           <w:b w:val="0"/>
           <w:sz w:val="24"/>
         </w:rPr>
@@ -45,6 +46,7 @@
       </w:pPr>
       <w:r>
         <w:rPr>
+          <w:rFonts w:ascii="Times New Roman" w:hAnsi="Times New Roman"/>
           <w:b w:val="0"/>
           <w:sz w:val="24"/>
         </w:rPr>
@@ -58,10 +60,11 @@
       </w:pPr>
       <w:r>
         <w:rPr>
+          <w:rFonts w:ascii="Times New Roman" w:hAnsi="Times New Roman"/>
           <w:b/>
           <w:sz w:val="24"/>
         </w:rPr>
-        <w:t>Grupo: José Eduardo, Márcio Fossa, Erick</w:t>
+        <w:t>Grupo: José Eduardo, Márcio Fossa e Erick Franzmann Bortoloti</w:t>
       </w:r>
     </w:p>
     <w:p>
@@ -71,154 +74,160 @@
       </w:pPr>
       <w:r>
         <w:rPr>
+          <w:rFonts w:ascii="Times New Roman" w:hAnsi="Times New Roman"/>
           <w:b w:val="0"/>
           <w:sz w:val="24"/>
         </w:rPr>
-        <w:t>Data de entrega: Outubro de 2026</w:t>
+        <w:t>Outubro de 2026</w:t>
       </w:r>
     </w:p>
     <w:p>
       <w:pPr>
-        <w:spacing w:after="120"/>
+        <w:spacing w:after="120" w:line="276" w:lineRule="auto"/>
         <w:jc w:val="center"/>
       </w:pPr>
       <w:r>
         <w:rPr>
+          <w:rFonts w:ascii="Times New Roman" w:hAnsi="Times New Roman"/>
           <w:b w:val="0"/>
           <w:sz w:val="22"/>
         </w:rPr>
-        <w:t>Repositório GitHub: https://github.com/jbr121/CRONOTACOGRAFOS</w:t>
-      </w:r>
-    </w:p>
-    <w:p/>
-    <w:p>
-      <w:pPr>
-        <w:pStyle w:val="Heading2"/>
-        <w:spacing w:before="280" w:after="120"/>
-      </w:pPr>
-      <w:r>
-        <w:t>1. Apresentação</w:t>
-      </w:r>
-    </w:p>
-    <w:p>
-      <w:pPr>
-        <w:spacing w:after="120"/>
-        <w:jc w:val="both"/>
-      </w:pPr>
-      <w:r>
-        <w:rPr>
-          <w:b w:val="0"/>
-          <w:sz w:val="24"/>
-        </w:rPr>
-        <w:t>Em conformidade com a política de transparência acadêmica da UNIVALI, este documento descreve de forma detalhada todos os pontos do projeto CronotaScan em que ferramentas de Inteligência Artificial Generativa (IAG) foram utilizadas como suporte ao desenvolvimento. Inclui o histórico completo de commits do repositório GitHub, identificando quais foram realizados com auxílio da IA e quais foram feitos exclusivamente pela equipe.</w:t>
-      </w:r>
-    </w:p>
-    <w:p>
-      <w:pPr>
-        <w:spacing w:after="120"/>
-        <w:jc w:val="both"/>
-      </w:pPr>
-      <w:r>
-        <w:rPr>
-          <w:b w:val="0"/>
-          <w:sz w:val="24"/>
-        </w:rPr>
-        <w:t>O uso de IA não substituiu o raciocínio crítico da equipe: todas as sugestões geradas foram revisadas, adaptadas e validadas pelos integrantes antes de serem incorporadas. A equipe se responsabiliza integralmente pelo conteúdo entregue.</w:t>
+        <w:t>Repositório: https://github.com/jbr121/CRONOTACOGRAFOS</w:t>
       </w:r>
     </w:p>
     <w:p>
       <w:pPr>
         <w:pStyle w:val="Heading2"/>
-        <w:spacing w:before="280" w:after="120"/>
+        <w:spacing w:before="240" w:after="120"/>
       </w:pPr>
       <w:r>
-        <w:t>2. Ferramenta de IA Utilizada</w:t>
+        <w:t>1. O que este documento declara</w:t>
       </w:r>
     </w:p>
     <w:p>
       <w:pPr>
-        <w:spacing w:after="120"/>
+        <w:spacing w:after="120" w:line="276" w:lineRule="auto"/>
         <w:jc w:val="both"/>
       </w:pPr>
       <w:r>
         <w:rPr>
+          <w:rFonts w:ascii="Times New Roman" w:hAnsi="Times New Roman"/>
           <w:b w:val="0"/>
           <w:sz w:val="24"/>
         </w:rPr>
-        <w:t>Ferramenta: Cursor (https://cursor.com) — ambiente de desenvolvimento integrado com IA.</w:t>
+        <w:t>Este texto informa onde a equipe usou inteligência artificial generativa no CronotaScan e lista todos os commits existentes no GitHub até 23/10/2026, inclusive os que estão em branches e ainda não foram unidos ao master. Os dados foram lidos do Git (autor, data com fuso, mensagem e arquivos). Horários abaixo estão no fuso de São Paulo (UTC−3).</w:t>
+      </w:r>
+    </w:p>
+    <w:p>
+      <w:pPr>
+        <w:spacing w:after="120" w:line="276" w:lineRule="auto"/>
+        <w:jc w:val="both"/>
+      </w:pPr>
+      <w:r>
+        <w:rPr>
+          <w:rFonts w:ascii="Times New Roman" w:hAnsi="Times New Roman"/>
+          <w:b w:val="0"/>
+          <w:sz w:val="24"/>
+        </w:rPr>
+        <w:t>A equipe revisou o que o agente escreveu antes de incorporar. A responsabilidade pelo conteúdo entregue é do grupo.</w:t>
+      </w:r>
+    </w:p>
+    <w:p>
+      <w:pPr>
+        <w:pStyle w:val="Heading2"/>
+        <w:spacing w:before="240" w:after="120"/>
+      </w:pPr>
+      <w:r>
+        <w:t>2. Ferramenta</w:t>
       </w:r>
     </w:p>
     <w:p>
       <w:pPr>
         <w:pStyle w:val="ListBullet"/>
-        <w:spacing w:after="80"/>
+        <w:spacing w:after="60"/>
       </w:pPr>
       <w:r>
         <w:rPr>
+          <w:rFonts w:ascii="Times New Roman" w:hAnsi="Times New Roman"/>
           <w:sz w:val="24"/>
         </w:rPr>
-        <w:t>Modelo de IA: Claude Opus 5.5 / Claude Sonnet 4.6 (Anthropic)</w:t>
+        <w:t>Ferramenta: Cursor (https://cursor.com), modo Cloud Agent.</w:t>
       </w:r>
     </w:p>
     <w:p>
       <w:pPr>
         <w:pStyle w:val="ListBullet"/>
-        <w:spacing w:after="80"/>
+        <w:spacing w:after="60"/>
       </w:pPr>
       <w:r>
         <w:rPr>
+          <w:rFonts w:ascii="Times New Roman" w:hAnsi="Times New Roman"/>
           <w:sz w:val="24"/>
         </w:rPr>
-        <w:t>Modo: Cloud Agent — o assistente lê, edita e faz commit de arquivos do projeto sob supervisão do desenvolvedor</w:t>
+        <w:t>O único commit que nomeia o modelo é o b3454bb: Co-Authored-By Claude Opus 5.5 (Anthropic).</w:t>
       </w:r>
     </w:p>
     <w:p>
       <w:pPr>
         <w:pStyle w:val="ListBullet"/>
-        <w:spacing w:after="80"/>
+        <w:spacing w:after="60"/>
       </w:pPr>
       <w:r>
         <w:rPr>
+          <w:rFonts w:ascii="Times New Roman" w:hAnsi="Times New Roman"/>
           <w:sz w:val="24"/>
         </w:rPr>
-        <w:t>Identificação nos commits: o autor aparece como "Cursor Agent" ou como "Co-Authored-By: Claude Opus 5.5"</w:t>
+        <w:t>Nos demais commits de agente, o Git registra o autor como Cursor Agent e José Eduardo como Co-authored-by. O nome do modelo não foi gravado nesses commits, então ele não é inventado aqui.</w:t>
       </w:r>
     </w:p>
     <w:p>
       <w:pPr>
-        <w:spacing w:after="120"/>
-        <w:jc w:val="both"/>
+        <w:pStyle w:val="ListBullet"/>
+        <w:spacing w:after="60"/>
       </w:pPr>
       <w:r>
         <w:rPr>
-          <w:b w:val="0"/>
+          <w:rFonts w:ascii="Times New Roman" w:hAnsi="Times New Roman"/>
           <w:sz w:val="24"/>
         </w:rPr>
-        <w:t>Cada commit feito com IA é identificado claramente no histórico do GitHub com o autor "Cursor Agent" ou com a linha Co-Authored-By. Os commits feitos somente pela equipe têm como autor o nome do integrante (jbr121 = José Eduardo, ErickFbort = Erick).</w:t>
+        <w:t>Este arquivo (docs/CronotaScan_Uso_de_IA.docx) e o script docs/gerar_uso_ia.py foram redigidos pelo Cloud Agent do Cursor, a pedido da equipe, para a entrega do M2.</w:t>
       </w:r>
     </w:p>
     <w:p>
       <w:pPr>
         <w:pStyle w:val="Heading2"/>
-        <w:spacing w:before="280" w:after="120"/>
+        <w:spacing w:before="240" w:after="120"/>
       </w:pPr>
       <w:r>
-        <w:t>3. Histórico Completo de Commits</w:t>
+        <w:t>3. Commits do repositório</w:t>
       </w:r>
     </w:p>
     <w:p>
       <w:pPr>
-        <w:spacing w:after="120"/>
+        <w:spacing w:after="120" w:line="276" w:lineRule="auto"/>
         <w:jc w:val="both"/>
       </w:pPr>
       <w:r>
         <w:rPr>
+          <w:rFonts w:ascii="Times New Roman" w:hAnsi="Times New Roman"/>
           <w:b w:val="0"/>
           <w:sz w:val="24"/>
         </w:rPr>
-        <w:t>O repositório está em: https://github.com/jbr121/CRONOTACOGRAFOS</w:t>
-        <w:br/>
-        <w:t>A tabela abaixo lista todos os commits em ordem cronológica. Commits com fundo amarelo envolveram o uso de IA; commits com fundo branco foram feitos exclusivamente pela equipe.</w:t>
+        <w:t>São 14 commits no total, em quatro linhas de histórico. Fundo amarelo: o Git mostra uso de IA ou a mensagem diz que o commit aplica o cloud agent. Fundo branco: commit só da equipe.</w:t>
+      </w:r>
+    </w:p>
+    <w:p>
+      <w:pPr>
+        <w:spacing w:after="120" w:line="276" w:lineRule="auto"/>
+        <w:jc w:val="both"/>
+      </w:pPr>
+      <w:r>
+        <w:rPr>
+          <w:rFonts w:ascii="Times New Roman" w:hAnsi="Times New Roman"/>
+          <w:b w:val="0"/>
+          <w:sz w:val="24"/>
+        </w:rPr>
+        <w:t>Márcio Fossa integra o grupo e assina esta declaração. Até esta data ele não aparece como autor de commit no repositório.</w:t>
       </w:r>
     </w:p>
     <w:tbl>
@@ -229,27 +238,28 @@
         <w:tblLook w:firstColumn="1" w:firstRow="1" w:lastColumn="0" w:lastRow="0" w:noHBand="0" w:noVBand="1" w:val="04A0"/>
       </w:tblPr>
       <w:tblGrid>
-        <w:gridCol w:w="2351"/>
-        <w:gridCol w:w="2351"/>
-        <w:gridCol w:w="2351"/>
-        <w:gridCol w:w="2351"/>
+        <w:gridCol w:w="2268"/>
+        <w:gridCol w:w="2268"/>
+        <w:gridCol w:w="2268"/>
+        <w:gridCol w:w="2268"/>
       </w:tblGrid>
       <w:tr>
         <w:tc>
           <w:tcPr>
-            <w:tcW w:type="dxa" w:w="1247"/>
+            <w:tcW w:type="dxa" w:w="1134"/>
             <w:shd w:val="clear" w:color="auto" w:fill="1F3864"/>
           </w:tcPr>
           <w:p>
             <w:pPr>
-              <w:spacing w:after="0"/>
+              <w:spacing w:after="0" w:before="0"/>
             </w:pPr>
             <w:r/>
             <w:r>
               <w:rPr>
+                <w:rFonts w:ascii="Times New Roman" w:hAnsi="Times New Roman"/>
                 <w:b/>
                 <w:color w:val="FFFFFF"/>
-                <w:sz w:val="20"/>
+                <w:sz w:val="18"/>
               </w:rPr>
               <w:t>Hash</w:t>
             </w:r>
@@ -257,61 +267,64 @@
         </w:tc>
         <w:tc>
           <w:tcPr>
-            <w:tcW w:type="dxa" w:w="1984"/>
+            <w:tcW w:type="dxa" w:w="2041"/>
             <w:shd w:val="clear" w:color="auto" w:fill="1F3864"/>
           </w:tcPr>
           <w:p>
             <w:pPr>
-              <w:spacing w:after="0"/>
+              <w:spacing w:after="0" w:before="0"/>
             </w:pPr>
             <w:r/>
             <w:r>
               <w:rPr>
+                <w:rFonts w:ascii="Times New Roman" w:hAnsi="Times New Roman"/>
                 <w:b/>
                 <w:color w:val="FFFFFF"/>
-                <w:sz w:val="20"/>
+                <w:sz w:val="18"/>
               </w:rPr>
-              <w:t>Data / Autor</w:t>
+              <w:t>Data (São Paulo) e autor</w:t>
             </w:r>
           </w:p>
         </w:tc>
         <w:tc>
           <w:tcPr>
-            <w:tcW w:type="dxa" w:w="1984"/>
+            <w:tcW w:type="dxa" w:w="2381"/>
             <w:shd w:val="clear" w:color="auto" w:fill="1F3864"/>
           </w:tcPr>
           <w:p>
             <w:pPr>
-              <w:spacing w:after="0"/>
+              <w:spacing w:after="0" w:before="0"/>
             </w:pPr>
             <w:r/>
             <w:r>
               <w:rPr>
+                <w:rFonts w:ascii="Times New Roman" w:hAnsi="Times New Roman"/>
                 <w:b/>
                 <w:color w:val="FFFFFF"/>
-                <w:sz w:val="20"/>
+                <w:sz w:val="18"/>
               </w:rPr>
-              <w:t>Mensagem do Commit</w:t>
+              <w:t>Branch e mensagem</w:t>
             </w:r>
           </w:p>
         </w:tc>
         <w:tc>
           <w:tcPr>
-            <w:tcW w:type="dxa" w:w="4989"/>
+            <w:tcW w:type="dxa" w:w="3515"/>
             <w:shd w:val="clear" w:color="auto" w:fill="1F3864"/>
           </w:tcPr>
           <w:p>
             <w:pPr>
-              <w:spacing w:after="0"/>
+              <w:spacing w:after="0" w:before="0"/>
             </w:pPr>
             <w:r/>
             <w:r>
               <w:rPr>
+                <w:rFonts w:ascii="Times New Roman" w:hAnsi="Times New Roman"/>
                 <w:b/>
                 <w:color w:val="FFFFFF"/>
-                <w:sz w:val="20"/>
+                <w:sz w:val="18"/>
               </w:rPr>
-              <w:t>O que foi feito</w:t>
+              <w:t>O que o commit contém</w:t>
             </w:r>
           </w:p>
         </w:tc>
@@ -319,18 +332,19 @@
       <w:tr>
         <w:tc>
           <w:tcPr>
-            <w:tcW w:type="dxa" w:w="2351"/>
+            <w:tcW w:type="dxa" w:w="1134"/>
             <w:shd w:val="clear" w:color="auto" w:fill="FFFFFF"/>
           </w:tcPr>
           <w:p>
             <w:pPr>
-              <w:spacing w:after="0"/>
+              <w:spacing w:after="0" w:before="0"/>
             </w:pPr>
             <w:r/>
             <w:r>
               <w:rPr>
-                <w:b w:val="0"/>
-                <w:sz w:val="18"/>
+                <w:rFonts w:ascii="Times New Roman" w:hAnsi="Times New Roman"/>
+                <w:b/>
+                <w:sz w:val="16"/>
               </w:rPr>
               <w:t>a30940f</w:t>
             </w:r>
@@ -338,39 +352,57 @@
         </w:tc>
         <w:tc>
           <w:tcPr>
-            <w:tcW w:type="dxa" w:w="2351"/>
+            <w:tcW w:type="dxa" w:w="2041"/>
             <w:shd w:val="clear" w:color="auto" w:fill="FFFFFF"/>
           </w:tcPr>
           <w:p>
             <w:pPr>
-              <w:spacing w:after="0"/>
+              <w:spacing w:after="0" w:before="0"/>
             </w:pPr>
             <w:r/>
             <w:r>
               <w:rPr>
+                <w:rFonts w:ascii="Times New Roman" w:hAnsi="Times New Roman"/>
                 <w:b w:val="0"/>
-                <w:sz w:val="18"/>
+                <w:sz w:val="16"/>
               </w:rPr>
               <w:t>14/08/2026 16:00</w:t>
               <w:br/>
+            </w:r>
+            <w:r>
+              <w:rPr>
+                <w:rFonts w:ascii="Times New Roman" w:hAnsi="Times New Roman"/>
+                <w:b w:val="0"/>
+                <w:sz w:val="16"/>
+              </w:rPr>
               <w:t>José Eduardo (jbr121)</w:t>
             </w:r>
           </w:p>
         </w:tc>
         <w:tc>
           <w:tcPr>
-            <w:tcW w:type="dxa" w:w="2351"/>
+            <w:tcW w:type="dxa" w:w="2381"/>
             <w:shd w:val="clear" w:color="auto" w:fill="FFFFFF"/>
           </w:tcPr>
           <w:p>
             <w:pPr>
-              <w:spacing w:after="0"/>
+              <w:spacing w:after="0" w:before="0"/>
             </w:pPr>
             <w:r/>
             <w:r>
               <w:rPr>
-                <w:b/>
-                <w:sz w:val="18"/>
+                <w:rFonts w:ascii="Times New Roman" w:hAnsi="Times New Roman"/>
+                <w:b w:val="0"/>
+                <w:sz w:val="16"/>
+              </w:rPr>
+              <w:t>master</w:t>
+              <w:br/>
+            </w:r>
+            <w:r>
+              <w:rPr>
+                <w:rFonts w:ascii="Times New Roman" w:hAnsi="Times New Roman"/>
+                <w:b w:val="0"/>
+                <w:sz w:val="16"/>
               </w:rPr>
               <w:t>Initial commit: CronotaScan PGI Univali</w:t>
             </w:r>
@@ -378,20 +410,21 @@
         </w:tc>
         <w:tc>
           <w:tcPr>
-            <w:tcW w:type="dxa" w:w="2351"/>
+            <w:tcW w:type="dxa" w:w="3515"/>
             <w:shd w:val="clear" w:color="auto" w:fill="FFFFFF"/>
           </w:tcPr>
           <w:p>
             <w:pPr>
-              <w:spacing w:after="0"/>
+              <w:spacing w:after="0" w:before="0"/>
             </w:pPr>
             <w:r/>
             <w:r>
               <w:rPr>
+                <w:rFonts w:ascii="Times New Roman" w:hAnsi="Times New Roman"/>
                 <w:b w:val="0"/>
-                <w:sz w:val="18"/>
+                <w:sz w:val="16"/>
               </w:rPr>
-              <w:t>Estrutura inicial do projeto: FastAPI, banco SQLite, front-end SPA e pipeline básico de leitura.</w:t>
+              <w:t>Estrutura inicial feita pela equipe: FastAPI, SQLite, interface e pipeline básico. Não há coautoria de IA neste commit.</w:t>
             </w:r>
           </w:p>
         </w:tc>
@@ -399,18 +432,19 @@
       <w:tr>
         <w:tc>
           <w:tcPr>
-            <w:tcW w:type="dxa" w:w="2351"/>
+            <w:tcW w:type="dxa" w:w="1134"/>
             <w:shd w:val="clear" w:color="auto" w:fill="FFFFFF"/>
           </w:tcPr>
           <w:p>
             <w:pPr>
-              <w:spacing w:after="0"/>
+              <w:spacing w:after="0" w:before="0"/>
             </w:pPr>
             <w:r/>
             <w:r>
               <w:rPr>
-                <w:b w:val="0"/>
-                <w:sz w:val="18"/>
+                <w:rFonts w:ascii="Times New Roman" w:hAnsi="Times New Roman"/>
+                <w:b/>
+                <w:sz w:val="16"/>
               </w:rPr>
               <w:t>b6438e2</w:t>
             </w:r>
@@ -418,39 +452,57 @@
         </w:tc>
         <w:tc>
           <w:tcPr>
-            <w:tcW w:type="dxa" w:w="2351"/>
+            <w:tcW w:type="dxa" w:w="2041"/>
             <w:shd w:val="clear" w:color="auto" w:fill="FFFFFF"/>
           </w:tcPr>
           <w:p>
             <w:pPr>
-              <w:spacing w:after="0"/>
+              <w:spacing w:after="0" w:before="0"/>
             </w:pPr>
             <w:r/>
             <w:r>
               <w:rPr>
+                <w:rFonts w:ascii="Times New Roman" w:hAnsi="Times New Roman"/>
                 <w:b w:val="0"/>
-                <w:sz w:val="18"/>
+                <w:sz w:val="16"/>
               </w:rPr>
               <w:t>14/08/2026 16:30</w:t>
               <w:br/>
+            </w:r>
+            <w:r>
+              <w:rPr>
+                <w:rFonts w:ascii="Times New Roman" w:hAnsi="Times New Roman"/>
+                <w:b w:val="0"/>
+                <w:sz w:val="16"/>
+              </w:rPr>
               <w:t>José Eduardo (jbr121)</w:t>
             </w:r>
           </w:p>
         </w:tc>
         <w:tc>
           <w:tcPr>
-            <w:tcW w:type="dxa" w:w="2351"/>
+            <w:tcW w:type="dxa" w:w="2381"/>
             <w:shd w:val="clear" w:color="auto" w:fill="FFFFFF"/>
           </w:tcPr>
           <w:p>
             <w:pPr>
-              <w:spacing w:after="0"/>
+              <w:spacing w:after="0" w:before="0"/>
             </w:pPr>
             <w:r/>
             <w:r>
               <w:rPr>
-                <w:b/>
-                <w:sz w:val="18"/>
+                <w:rFonts w:ascii="Times New Roman" w:hAnsi="Times New Roman"/>
+                <w:b w:val="0"/>
+                <w:sz w:val="16"/>
+              </w:rPr>
+              <w:t>master</w:t>
+              <w:br/>
+            </w:r>
+            <w:r>
+              <w:rPr>
+                <w:rFonts w:ascii="Times New Roman" w:hAnsi="Times New Roman"/>
+                <w:b w:val="0"/>
+                <w:sz w:val="16"/>
               </w:rPr>
               <w:t>Add tutorial for running CronotaScan on Univali lab PCs.</w:t>
             </w:r>
@@ -458,20 +510,21 @@
         </w:tc>
         <w:tc>
           <w:tcPr>
-            <w:tcW w:type="dxa" w:w="2351"/>
+            <w:tcW w:type="dxa" w:w="3515"/>
             <w:shd w:val="clear" w:color="auto" w:fill="FFFFFF"/>
           </w:tcPr>
           <w:p>
             <w:pPr>
-              <w:spacing w:after="0"/>
+              <w:spacing w:after="0" w:before="0"/>
             </w:pPr>
             <w:r/>
             <w:r>
               <w:rPr>
+                <w:rFonts w:ascii="Times New Roman" w:hAnsi="Times New Roman"/>
                 <w:b w:val="0"/>
-                <w:sz w:val="18"/>
+                <w:sz w:val="16"/>
               </w:rPr>
-              <w:t>Tutorial passo a passo para rodar o sistema nos computadores do laboratório da UNIVALI.</w:t>
+              <w:t>Tutorial para rodar o sistema nos computadores do laboratório da UNIVALI. Sem coautoria de IA.</w:t>
             </w:r>
           </w:p>
         </w:tc>
@@ -479,18 +532,19 @@
       <w:tr>
         <w:tc>
           <w:tcPr>
-            <w:tcW w:type="dxa" w:w="2351"/>
+            <w:tcW w:type="dxa" w:w="1134"/>
             <w:shd w:val="clear" w:color="auto" w:fill="FFFFFF"/>
           </w:tcPr>
           <w:p>
             <w:pPr>
-              <w:spacing w:after="0"/>
+              <w:spacing w:after="0" w:before="0"/>
             </w:pPr>
             <w:r/>
             <w:r>
               <w:rPr>
-                <w:b w:val="0"/>
-                <w:sz w:val="18"/>
+                <w:rFonts w:ascii="Times New Roman" w:hAnsi="Times New Roman"/>
+                <w:b/>
+                <w:sz w:val="16"/>
               </w:rPr>
               <w:t>23957bb</w:t>
             </w:r>
@@ -498,39 +552,57 @@
         </w:tc>
         <w:tc>
           <w:tcPr>
-            <w:tcW w:type="dxa" w:w="2351"/>
+            <w:tcW w:type="dxa" w:w="2041"/>
             <w:shd w:val="clear" w:color="auto" w:fill="FFFFFF"/>
           </w:tcPr>
           <w:p>
             <w:pPr>
-              <w:spacing w:after="0"/>
+              <w:spacing w:after="0" w:before="0"/>
             </w:pPr>
             <w:r/>
             <w:r>
               <w:rPr>
+                <w:rFonts w:ascii="Times New Roman" w:hAnsi="Times New Roman"/>
                 <w:b w:val="0"/>
-                <w:sz w:val="18"/>
+                <w:sz w:val="16"/>
               </w:rPr>
               <w:t>14/08/2026 16:32</w:t>
               <w:br/>
+            </w:r>
+            <w:r>
+              <w:rPr>
+                <w:rFonts w:ascii="Times New Roman" w:hAnsi="Times New Roman"/>
+                <w:b w:val="0"/>
+                <w:sz w:val="16"/>
+              </w:rPr>
               <w:t>José Eduardo (jbr121)</w:t>
             </w:r>
           </w:p>
         </w:tc>
         <w:tc>
           <w:tcPr>
-            <w:tcW w:type="dxa" w:w="2351"/>
+            <w:tcW w:type="dxa" w:w="2381"/>
             <w:shd w:val="clear" w:color="auto" w:fill="FFFFFF"/>
           </w:tcPr>
           <w:p>
             <w:pPr>
-              <w:spacing w:after="0"/>
+              <w:spacing w:after="0" w:before="0"/>
             </w:pPr>
             <w:r/>
             <w:r>
               <w:rPr>
-                <w:b/>
-                <w:sz w:val="18"/>
+                <w:rFonts w:ascii="Times New Roman" w:hAnsi="Times New Roman"/>
+                <w:b w:val="0"/>
+                <w:sz w:val="16"/>
+              </w:rPr>
+              <w:t>master</w:t>
+              <w:br/>
+            </w:r>
+            <w:r>
+              <w:rPr>
+                <w:rFonts w:ascii="Times New Roman" w:hAnsi="Times New Roman"/>
+                <w:b w:val="0"/>
+                <w:sz w:val="16"/>
               </w:rPr>
               <w:t>Add ES2 complementary documentation without changing existing PGI plan.</w:t>
             </w:r>
@@ -538,20 +610,21 @@
         </w:tc>
         <w:tc>
           <w:tcPr>
-            <w:tcW w:type="dxa" w:w="2351"/>
+            <w:tcW w:type="dxa" w:w="3515"/>
             <w:shd w:val="clear" w:color="auto" w:fill="FFFFFF"/>
           </w:tcPr>
           <w:p>
             <w:pPr>
-              <w:spacing w:after="0"/>
+              <w:spacing w:after="0" w:before="0"/>
             </w:pPr>
             <w:r/>
             <w:r>
               <w:rPr>
+                <w:rFonts w:ascii="Times New Roman" w:hAnsi="Times New Roman"/>
                 <w:b w:val="0"/>
-                <w:sz w:val="18"/>
+                <w:sz w:val="16"/>
               </w:rPr>
-              <w:t>Documentação complementar de Engenharia de Software II sem alterar o plano PGI existente.</w:t>
+              <w:t>Documentação complementar de Engenharia de Software II. Sem coautoria de IA.</w:t>
             </w:r>
           </w:p>
         </w:tc>
@@ -559,18 +632,19 @@
       <w:tr>
         <w:tc>
           <w:tcPr>
-            <w:tcW w:type="dxa" w:w="2351"/>
+            <w:tcW w:type="dxa" w:w="1134"/>
             <w:shd w:val="clear" w:color="auto" w:fill="FFF2CC"/>
           </w:tcPr>
           <w:p>
             <w:pPr>
-              <w:spacing w:after="0"/>
+              <w:spacing w:after="0" w:before="0"/>
             </w:pPr>
             <w:r/>
             <w:r>
               <w:rPr>
-                <w:b w:val="0"/>
-                <w:sz w:val="18"/>
+                <w:rFonts w:ascii="Times New Roman" w:hAnsi="Times New Roman"/>
+                <w:b/>
+                <w:sz w:val="16"/>
               </w:rPr>
               <w:t>b3454bb</w:t>
             </w:r>
@@ -578,39 +652,57 @@
         </w:tc>
         <w:tc>
           <w:tcPr>
-            <w:tcW w:type="dxa" w:w="2351"/>
+            <w:tcW w:type="dxa" w:w="2041"/>
             <w:shd w:val="clear" w:color="auto" w:fill="FFF2CC"/>
           </w:tcPr>
           <w:p>
             <w:pPr>
-              <w:spacing w:after="0"/>
+              <w:spacing w:after="0" w:before="0"/>
             </w:pPr>
             <w:r/>
             <w:r>
               <w:rPr>
+                <w:rFonts w:ascii="Times New Roman" w:hAnsi="Times New Roman"/>
                 <w:b w:val="0"/>
-                <w:sz w:val="18"/>
+                <w:sz w:val="16"/>
               </w:rPr>
               <w:t>25/09/2026 20:48</w:t>
               <w:br/>
-              <w:t>Erick Franzmann Bortoloti + Claude Opus 5.5 (IA)</w:t>
+            </w:r>
+            <w:r>
+              <w:rPr>
+                <w:rFonts w:ascii="Times New Roman" w:hAnsi="Times New Roman"/>
+                <w:b w:val="0"/>
+                <w:sz w:val="16"/>
+              </w:rPr>
+              <w:t>Erick Franzmann Bortoloti</w:t>
             </w:r>
           </w:p>
         </w:tc>
         <w:tc>
           <w:tcPr>
-            <w:tcW w:type="dxa" w:w="2351"/>
+            <w:tcW w:type="dxa" w:w="2381"/>
             <w:shd w:val="clear" w:color="auto" w:fill="FFF2CC"/>
           </w:tcPr>
           <w:p>
             <w:pPr>
-              <w:spacing w:after="0"/>
+              <w:spacing w:after="0" w:before="0"/>
             </w:pPr>
             <w:r/>
             <w:r>
               <w:rPr>
-                <w:b/>
-                <w:sz w:val="18"/>
+                <w:rFonts w:ascii="Times New Roman" w:hAnsi="Times New Roman"/>
+                <w:b w:val="0"/>
+                <w:sz w:val="16"/>
+              </w:rPr>
+              <w:t>master</w:t>
+              <w:br/>
+            </w:r>
+            <w:r>
+              <w:rPr>
+                <w:rFonts w:ascii="Times New Roman" w:hAnsi="Times New Roman"/>
+                <w:b w:val="0"/>
+                <w:sz w:val="16"/>
               </w:rPr>
               <w:t>Integrate v2 disc reader with perspective correction and validation</w:t>
             </w:r>
@@ -618,20 +710,21 @@
         </w:tc>
         <w:tc>
           <w:tcPr>
-            <w:tcW w:type="dxa" w:w="2351"/>
+            <w:tcW w:type="dxa" w:w="3515"/>
             <w:shd w:val="clear" w:color="auto" w:fill="FFF2CC"/>
           </w:tcPr>
           <w:p>
             <w:pPr>
-              <w:spacing w:after="0"/>
+              <w:spacing w:after="0" w:before="0"/>
             </w:pPr>
             <w:r/>
             <w:r>
               <w:rPr>
+                <w:rFonts w:ascii="Times New Roman" w:hAnsi="Times New Roman"/>
                 <w:b w:val="0"/>
-                <w:sz w:val="18"/>
+                <w:sz w:val="16"/>
               </w:rPr>
-              <w:t>Reformulação completa do pipeline OpenCV (1125 linhas alteradas): detecção da borda do disco como elipse, homografia para correção de perspectiva (elipse → círculo), orientação pelo arco verde 12h–24h, autocalibração pelos anéis de 20 km/h impressos, leitura da barra de atividade para filtrar minutos parados. Co-Authored-By: Claude Opus 5.5 (Anthropic).</w:t>
+              <w:t>Reescrita do leitor em core/processador_imagem.py (494 linhas adicionadas, 647 removidas), mais ajustes em main.py, static/index.html e core/gerador_pdf.py. O corpo do commit declara Co-Authored-By: Claude Opus 5.5 (Anthropic). Conteúdo: borda do disco como elipse, homografia, arco verde 12h–24h, faixas radiais de velocidade e atividade, autocalibração pelos anéis de 20 km/h.</w:t>
             </w:r>
           </w:p>
         </w:tc>
@@ -639,18 +732,19 @@
       <w:tr>
         <w:tc>
           <w:tcPr>
-            <w:tcW w:type="dxa" w:w="2351"/>
+            <w:tcW w:type="dxa" w:w="1134"/>
             <w:shd w:val="clear" w:color="auto" w:fill="FFF2CC"/>
           </w:tcPr>
           <w:p>
             <w:pPr>
-              <w:spacing w:after="0"/>
+              <w:spacing w:after="0" w:before="0"/>
             </w:pPr>
             <w:r/>
             <w:r>
               <w:rPr>
-                <w:b w:val="0"/>
-                <w:sz w:val="18"/>
+                <w:rFonts w:ascii="Times New Roman" w:hAnsi="Times New Roman"/>
+                <w:b/>
+                <w:sz w:val="16"/>
               </w:rPr>
               <w:t>10090b4</w:t>
             </w:r>
@@ -658,39 +752,57 @@
         </w:tc>
         <w:tc>
           <w:tcPr>
-            <w:tcW w:type="dxa" w:w="2351"/>
+            <w:tcW w:type="dxa" w:w="2041"/>
             <w:shd w:val="clear" w:color="auto" w:fill="FFF2CC"/>
           </w:tcPr>
           <w:p>
             <w:pPr>
-              <w:spacing w:after="0"/>
+              <w:spacing w:after="0" w:before="0"/>
             </w:pPr>
             <w:r/>
             <w:r>
               <w:rPr>
+                <w:rFonts w:ascii="Times New Roman" w:hAnsi="Times New Roman"/>
                 <w:b w:val="0"/>
-                <w:sz w:val="18"/>
+                <w:sz w:val="16"/>
               </w:rPr>
-              <w:t>09/10/2026 18:46</w:t>
+              <w:t>09/10/2026 15:46</w:t>
               <w:br/>
-              <w:t>Cursor Agent (IA) + José Eduardo</w:t>
+            </w:r>
+            <w:r>
+              <w:rPr>
+                <w:rFonts w:ascii="Times New Roman" w:hAnsi="Times New Roman"/>
+                <w:b w:val="0"/>
+                <w:sz w:val="16"/>
+              </w:rPr>
+              <w:t>Cursor Agent; coautor José Eduardo</w:t>
             </w:r>
           </w:p>
         </w:tc>
         <w:tc>
           <w:tcPr>
-            <w:tcW w:type="dxa" w:w="2351"/>
+            <w:tcW w:type="dxa" w:w="2381"/>
             <w:shd w:val="clear" w:color="auto" w:fill="FFF2CC"/>
           </w:tcPr>
           <w:p>
             <w:pPr>
-              <w:spacing w:after="0"/>
+              <w:spacing w:after="0" w:before="0"/>
             </w:pPr>
             <w:r/>
             <w:r>
               <w:rPr>
-                <w:b/>
-                <w:sz w:val="18"/>
+                <w:rFonts w:ascii="Times New Roman" w:hAnsi="Times New Roman"/>
+                <w:b w:val="0"/>
+                <w:sz w:val="16"/>
+              </w:rPr>
+              <w:t>cursor/corrigir-leitura-disco-2731</w:t>
+              <w:br/>
+            </w:r>
+            <w:r>
+              <w:rPr>
+                <w:rFonts w:ascii="Times New Roman" w:hAnsi="Times New Roman"/>
+                <w:b w:val="0"/>
+                <w:sz w:val="16"/>
               </w:rPr>
               <w:t>Corrige rastreamento da curva do disco</w:t>
             </w:r>
@@ -698,20 +810,21 @@
         </w:tc>
         <w:tc>
           <w:tcPr>
-            <w:tcW w:type="dxa" w:w="2351"/>
+            <w:tcW w:type="dxa" w:w="3515"/>
             <w:shd w:val="clear" w:color="auto" w:fill="FFF2CC"/>
           </w:tcPr>
           <w:p>
             <w:pPr>
-              <w:spacing w:after="0"/>
+              <w:spacing w:after="0" w:before="0"/>
             </w:pPr>
             <w:r/>
             <w:r>
               <w:rPr>
+                <w:rFonts w:ascii="Times New Roman" w:hAnsi="Times New Roman"/>
                 <w:b w:val="0"/>
-                <w:sz w:val="18"/>
+                <w:sz w:val="16"/>
               </w:rPr>
-              <w:t>Correção de bugs no rastreamento da agulha de velocidade: ajuste das faixas radiais, remoção de impressão fixa do disco (linhas tracejadas confundidas com agulha) e criação dos primeiros testes unitários automatizados (tests/test_processador_imagem.py, 79 linhas).</w:t>
+              <w:t>Autor Git: Cursor Agent. Altera core/processador_imagem.py e cria tests/test_processador_imagem.py. Esta branch ainda não foi unida ao master.</w:t>
             </w:r>
           </w:p>
         </w:tc>
@@ -719,18 +832,19 @@
       <w:tr>
         <w:tc>
           <w:tcPr>
-            <w:tcW w:type="dxa" w:w="2351"/>
+            <w:tcW w:type="dxa" w:w="1134"/>
             <w:shd w:val="clear" w:color="auto" w:fill="FFF2CC"/>
           </w:tcPr>
           <w:p>
             <w:pPr>
-              <w:spacing w:after="0"/>
+              <w:spacing w:after="0" w:before="0"/>
             </w:pPr>
             <w:r/>
             <w:r>
               <w:rPr>
-                <w:b w:val="0"/>
-                <w:sz w:val="18"/>
+                <w:rFonts w:ascii="Times New Roman" w:hAnsi="Times New Roman"/>
+                <w:b/>
+                <w:sz w:val="16"/>
               </w:rPr>
               <w:t>634c6db</w:t>
             </w:r>
@@ -738,39 +852,57 @@
         </w:tc>
         <w:tc>
           <w:tcPr>
-            <w:tcW w:type="dxa" w:w="2351"/>
+            <w:tcW w:type="dxa" w:w="2041"/>
             <w:shd w:val="clear" w:color="auto" w:fill="FFF2CC"/>
           </w:tcPr>
           <w:p>
             <w:pPr>
-              <w:spacing w:after="0"/>
+              <w:spacing w:after="0" w:before="0"/>
             </w:pPr>
             <w:r/>
             <w:r>
               <w:rPr>
+                <w:rFonts w:ascii="Times New Roman" w:hAnsi="Times New Roman"/>
                 <w:b w:val="0"/>
-                <w:sz w:val="18"/>
+                <w:sz w:val="16"/>
               </w:rPr>
-              <w:t>21/10/2026 11:13</w:t>
+              <w:t>21/10/2026 08:13</w:t>
               <w:br/>
-              <w:t>Cursor Agent (IA) + José Eduardo</w:t>
+            </w:r>
+            <w:r>
+              <w:rPr>
+                <w:rFonts w:ascii="Times New Roman" w:hAnsi="Times New Roman"/>
+                <w:b w:val="0"/>
+                <w:sz w:val="16"/>
+              </w:rPr>
+              <w:t>Cursor Agent; coautor José Eduardo</w:t>
             </w:r>
           </w:p>
         </w:tc>
         <w:tc>
           <w:tcPr>
-            <w:tcW w:type="dxa" w:w="2351"/>
+            <w:tcW w:type="dxa" w:w="2381"/>
             <w:shd w:val="clear" w:color="auto" w:fill="FFF2CC"/>
           </w:tcPr>
           <w:p>
             <w:pPr>
-              <w:spacing w:after="0"/>
+              <w:spacing w:after="0" w:before="0"/>
             </w:pPr>
             <w:r/>
             <w:r>
               <w:rPr>
-                <w:b/>
-                <w:sz w:val="18"/>
+                <w:rFonts w:ascii="Times New Roman" w:hAnsi="Times New Roman"/>
+                <w:b w:val="0"/>
+                <w:sz w:val="16"/>
+              </w:rPr>
+              <w:t>cursor/corrigir-leitura-disco-2731</w:t>
+              <w:br/>
+            </w:r>
+            <w:r>
+              <w:rPr>
+                <w:rFonts w:ascii="Times New Roman" w:hAnsi="Times New Roman"/>
+                <w:b w:val="0"/>
+                <w:sz w:val="16"/>
               </w:rPr>
               <w:t>Calibra a leitura com discos de gabarito conhecido</w:t>
             </w:r>
@@ -778,20 +910,21 @@
         </w:tc>
         <w:tc>
           <w:tcPr>
-            <w:tcW w:type="dxa" w:w="2351"/>
+            <w:tcW w:type="dxa" w:w="3515"/>
             <w:shd w:val="clear" w:color="auto" w:fill="FFF2CC"/>
           </w:tcPr>
           <w:p>
             <w:pPr>
-              <w:spacing w:after="0"/>
+              <w:spacing w:after="0" w:before="0"/>
             </w:pPr>
             <w:r/>
             <w:r>
               <w:rPr>
+                <w:rFonts w:ascii="Times New Roman" w:hAnsi="Times New Roman"/>
                 <w:b w:val="0"/>
-                <w:sz w:val="18"/>
+                <w:sz w:val="16"/>
               </w:rPr>
-              <w:t>Calibração com discos reais: zera minutos parados quando a barra de atividade está visível, preserva trechos longos de velocidade constante, reconhece o arco verde mesmo com perspectiva. Adição de fixtures (discos sintéticos reto, inclinado e com lacuna) e testes automatizados com gabarito JSON (tests/test_fixtures_disco.py).</w:t>
+              <w:t>Zera minutos parados quando a barra de atividade é visível, preserva trechos longos de velocidade constante e ajusta o arco verde. Inclui fixtures sintéticos e tests/test_fixtures_disco.py.</w:t>
             </w:r>
           </w:p>
         </w:tc>
@@ -799,18 +932,19 @@
       <w:tr>
         <w:tc>
           <w:tcPr>
-            <w:tcW w:type="dxa" w:w="2351"/>
+            <w:tcW w:type="dxa" w:w="1134"/>
             <w:shd w:val="clear" w:color="auto" w:fill="FFF2CC"/>
           </w:tcPr>
           <w:p>
             <w:pPr>
-              <w:spacing w:after="0"/>
+              <w:spacing w:after="0" w:before="0"/>
             </w:pPr>
             <w:r/>
             <w:r>
               <w:rPr>
-                <w:b w:val="0"/>
-                <w:sz w:val="18"/>
+                <w:rFonts w:ascii="Times New Roman" w:hAnsi="Times New Roman"/>
+                <w:b/>
+                <w:sz w:val="16"/>
               </w:rPr>
               <w:t>920e257</w:t>
             </w:r>
@@ -818,39 +952,57 @@
         </w:tc>
         <w:tc>
           <w:tcPr>
-            <w:tcW w:type="dxa" w:w="2351"/>
+            <w:tcW w:type="dxa" w:w="2041"/>
             <w:shd w:val="clear" w:color="auto" w:fill="FFF2CC"/>
           </w:tcPr>
           <w:p>
             <w:pPr>
-              <w:spacing w:after="0"/>
+              <w:spacing w:after="0" w:before="0"/>
             </w:pPr>
             <w:r/>
             <w:r>
               <w:rPr>
+                <w:rFonts w:ascii="Times New Roman" w:hAnsi="Times New Roman"/>
                 <w:b w:val="0"/>
-                <w:sz w:val="18"/>
+                <w:sz w:val="16"/>
               </w:rPr>
-              <w:t>21/10/2026 11:24</w:t>
+              <w:t>21/10/2026 08:24</w:t>
               <w:br/>
-              <w:t>Cursor Agent (IA) + José Eduardo</w:t>
+            </w:r>
+            <w:r>
+              <w:rPr>
+                <w:rFonts w:ascii="Times New Roman" w:hAnsi="Times New Roman"/>
+                <w:b w:val="0"/>
+                <w:sz w:val="16"/>
+              </w:rPr>
+              <w:t>Cursor Agent; coautor José Eduardo</w:t>
             </w:r>
           </w:p>
         </w:tc>
         <w:tc>
           <w:tcPr>
-            <w:tcW w:type="dxa" w:w="2351"/>
+            <w:tcW w:type="dxa" w:w="2381"/>
             <w:shd w:val="clear" w:color="auto" w:fill="FFF2CC"/>
           </w:tcPr>
           <w:p>
             <w:pPr>
-              <w:spacing w:after="0"/>
+              <w:spacing w:after="0" w:before="0"/>
             </w:pPr>
             <w:r/>
             <w:r>
               <w:rPr>
-                <w:b/>
-                <w:sz w:val="18"/>
+                <w:rFonts w:ascii="Times New Roman" w:hAnsi="Times New Roman"/>
+                <w:b w:val="0"/>
+                <w:sz w:val="16"/>
+              </w:rPr>
+              <w:t>cursor/corrigir-leitura-disco-2731</w:t>
+              <w:br/>
+            </w:r>
+            <w:r>
+              <w:rPr>
+                <w:rFonts w:ascii="Times New Roman" w:hAnsi="Times New Roman"/>
+                <w:b w:val="0"/>
+                <w:sz w:val="16"/>
               </w:rPr>
               <w:t>Gera laudo PDF dos discos de gabarito</w:t>
             </w:r>
@@ -858,20 +1010,21 @@
         </w:tc>
         <w:tc>
           <w:tcPr>
-            <w:tcW w:type="dxa" w:w="2351"/>
+            <w:tcW w:type="dxa" w:w="3515"/>
             <w:shd w:val="clear" w:color="auto" w:fill="FFF2CC"/>
           </w:tcPr>
           <w:p>
             <w:pPr>
-              <w:spacing w:after="0"/>
+              <w:spacing w:after="0" w:before="0"/>
             </w:pPr>
             <w:r/>
             <w:r>
               <w:rPr>
+                <w:rFonts w:ascii="Times New Roman" w:hAnsi="Times New Roman"/>
                 <w:b w:val="0"/>
-                <w:sz w:val="18"/>
+                <w:sz w:val="16"/>
               </w:rPr>
-              <w:t>Geração do laudo PDF de auditoria com os resultados dos discos de gabarito para validação do pipeline.</w:t>
+              <w:t>Cria laudos/laudo_discos_gabarito.pdf com o resultado dos discos de gabarito.</w:t>
             </w:r>
           </w:p>
         </w:tc>
@@ -879,18 +1032,19 @@
       <w:tr>
         <w:tc>
           <w:tcPr>
-            <w:tcW w:type="dxa" w:w="2351"/>
+            <w:tcW w:type="dxa" w:w="1134"/>
             <w:shd w:val="clear" w:color="auto" w:fill="FFF2CC"/>
           </w:tcPr>
           <w:p>
             <w:pPr>
-              <w:spacing w:after="0"/>
+              <w:spacing w:after="0" w:before="0"/>
             </w:pPr>
             <w:r/>
             <w:r>
               <w:rPr>
-                <w:b w:val="0"/>
-                <w:sz w:val="18"/>
+                <w:rFonts w:ascii="Times New Roman" w:hAnsi="Times New Roman"/>
+                <w:b/>
+                <w:sz w:val="16"/>
               </w:rPr>
               <w:t>b6abd2f</w:t>
             </w:r>
@@ -898,39 +1052,57 @@
         </w:tc>
         <w:tc>
           <w:tcPr>
-            <w:tcW w:type="dxa" w:w="2351"/>
+            <w:tcW w:type="dxa" w:w="2041"/>
             <w:shd w:val="clear" w:color="auto" w:fill="FFF2CC"/>
           </w:tcPr>
           <w:p>
             <w:pPr>
-              <w:spacing w:after="0"/>
+              <w:spacing w:after="0" w:before="0"/>
             </w:pPr>
             <w:r/>
             <w:r>
               <w:rPr>
+                <w:rFonts w:ascii="Times New Roman" w:hAnsi="Times New Roman"/>
                 <w:b w:val="0"/>
-                <w:sz w:val="18"/>
+                <w:sz w:val="16"/>
               </w:rPr>
-              <w:t>21/10/2026 11:27</w:t>
+              <w:t>21/10/2026 08:27</w:t>
               <w:br/>
-              <w:t>Cursor Agent (IA) + José Eduardo</w:t>
+            </w:r>
+            <w:r>
+              <w:rPr>
+                <w:rFonts w:ascii="Times New Roman" w:hAnsi="Times New Roman"/>
+                <w:b w:val="0"/>
+                <w:sz w:val="16"/>
+              </w:rPr>
+              <w:t>Cursor Agent; coautor José Eduardo</w:t>
             </w:r>
           </w:p>
         </w:tc>
         <w:tc>
           <w:tcPr>
-            <w:tcW w:type="dxa" w:w="2351"/>
+            <w:tcW w:type="dxa" w:w="2381"/>
             <w:shd w:val="clear" w:color="auto" w:fill="FFF2CC"/>
           </w:tcPr>
           <w:p>
             <w:pPr>
-              <w:spacing w:after="0"/>
+              <w:spacing w:after="0" w:before="0"/>
             </w:pPr>
             <w:r/>
             <w:r>
               <w:rPr>
-                <w:b/>
-                <w:sz w:val="18"/>
+                <w:rFonts w:ascii="Times New Roman" w:hAnsi="Times New Roman"/>
+                <w:b w:val="0"/>
+                <w:sz w:val="16"/>
+              </w:rPr>
+              <w:t>cursor/corrigir-leitura-disco-2731</w:t>
+              <w:br/>
+            </w:r>
+            <w:r>
+              <w:rPr>
+                <w:rFonts w:ascii="Times New Roman" w:hAnsi="Times New Roman"/>
+                <w:b w:val="0"/>
+                <w:sz w:val="16"/>
               </w:rPr>
               <w:t>Inclui a interface e o dashboard no laudo PDF</w:t>
             </w:r>
@@ -938,20 +1110,21 @@
         </w:tc>
         <w:tc>
           <w:tcPr>
-            <w:tcW w:type="dxa" w:w="2351"/>
+            <w:tcW w:type="dxa" w:w="3515"/>
             <w:shd w:val="clear" w:color="auto" w:fill="FFF2CC"/>
           </w:tcPr>
           <w:p>
             <w:pPr>
-              <w:spacing w:after="0"/>
+              <w:spacing w:after="0" w:before="0"/>
             </w:pPr>
             <w:r/>
             <w:r>
               <w:rPr>
+                <w:rFonts w:ascii="Times New Roman" w:hAnsi="Times New Roman"/>
                 <w:b w:val="0"/>
-                <w:sz w:val="18"/>
+                <w:sz w:val="16"/>
               </w:rPr>
-              <w:t>Inserção de capturas de tela da interface web e do dashboard de infrações no laudo PDF para evidência visual.</w:t>
+              <w:t>Inclui laudos/fotos/interface.png e laudos/fotos/dashboard.png no laudo PDF.</w:t>
             </w:r>
           </w:p>
         </w:tc>
@@ -959,18 +1132,19 @@
       <w:tr>
         <w:tc>
           <w:tcPr>
-            <w:tcW w:type="dxa" w:w="2351"/>
+            <w:tcW w:type="dxa" w:w="1134"/>
             <w:shd w:val="clear" w:color="auto" w:fill="FFF2CC"/>
           </w:tcPr>
           <w:p>
             <w:pPr>
-              <w:spacing w:after="0"/>
+              <w:spacing w:after="0" w:before="0"/>
             </w:pPr>
             <w:r/>
             <w:r>
               <w:rPr>
-                <w:b w:val="0"/>
-                <w:sz w:val="18"/>
+                <w:rFonts w:ascii="Times New Roman" w:hAnsi="Times New Roman"/>
+                <w:b/>
+                <w:sz w:val="16"/>
               </w:rPr>
               <w:t>306196e</w:t>
             </w:r>
@@ -978,39 +1152,57 @@
         </w:tc>
         <w:tc>
           <w:tcPr>
-            <w:tcW w:type="dxa" w:w="2351"/>
+            <w:tcW w:type="dxa" w:w="2041"/>
             <w:shd w:val="clear" w:color="auto" w:fill="FFF2CC"/>
           </w:tcPr>
           <w:p>
             <w:pPr>
-              <w:spacing w:after="0"/>
+              <w:spacing w:after="0" w:before="0"/>
             </w:pPr>
             <w:r/>
             <w:r>
               <w:rPr>
+                <w:rFonts w:ascii="Times New Roman" w:hAnsi="Times New Roman"/>
                 <w:b w:val="0"/>
-                <w:sz w:val="18"/>
+                <w:sz w:val="16"/>
               </w:rPr>
-              <w:t>21/10/2026 11:39</w:t>
+              <w:t>21/10/2026 08:39</w:t>
               <w:br/>
-              <w:t>Cursor Agent (IA) + José Eduardo</w:t>
+            </w:r>
+            <w:r>
+              <w:rPr>
+                <w:rFonts w:ascii="Times New Roman" w:hAnsi="Times New Roman"/>
+                <w:b w:val="0"/>
+                <w:sz w:val="16"/>
+              </w:rPr>
+              <w:t>Cursor Agent; coautor José Eduardo</w:t>
             </w:r>
           </w:p>
         </w:tc>
         <w:tc>
           <w:tcPr>
-            <w:tcW w:type="dxa" w:w="2351"/>
+            <w:tcW w:type="dxa" w:w="2381"/>
             <w:shd w:val="clear" w:color="auto" w:fill="FFF2CC"/>
           </w:tcPr>
           <w:p>
             <w:pPr>
-              <w:spacing w:after="0"/>
+              <w:spacing w:after="0" w:before="0"/>
             </w:pPr>
             <w:r/>
             <w:r>
               <w:rPr>
-                <w:b/>
-                <w:sz w:val="18"/>
+                <w:rFonts w:ascii="Times New Roman" w:hAnsi="Times New Roman"/>
+                <w:b w:val="0"/>
+                <w:sz w:val="16"/>
+              </w:rPr>
+              <w:t>cursor/corrigir-leitura-disco-2731</w:t>
+              <w:br/>
+            </w:r>
+            <w:r>
+              <w:rPr>
+                <w:rFonts w:ascii="Times New Roman" w:hAnsi="Times New Roman"/>
+                <w:b w:val="0"/>
+                <w:sz w:val="16"/>
               </w:rPr>
               <w:t>Gera o PDF com a explicação das telas e funções</w:t>
             </w:r>
@@ -1018,20 +1210,21 @@
         </w:tc>
         <w:tc>
           <w:tcPr>
-            <w:tcW w:type="dxa" w:w="2351"/>
+            <w:tcW w:type="dxa" w:w="3515"/>
             <w:shd w:val="clear" w:color="auto" w:fill="FFF2CC"/>
           </w:tcPr>
           <w:p>
             <w:pPr>
-              <w:spacing w:after="0"/>
+              <w:spacing w:after="0" w:before="0"/>
             </w:pPr>
             <w:r/>
             <w:r>
               <w:rPr>
+                <w:rFonts w:ascii="Times New Roman" w:hAnsi="Times New Roman"/>
                 <w:b w:val="0"/>
-                <w:sz w:val="18"/>
+                <w:sz w:val="16"/>
               </w:rPr>
-              <w:t>Criação do PDF explicativo de todas as telas e funções do sistema CronotaScan (laudos/explicacao_telas_e_funcoes.pdf).</w:t>
+              <w:t>Cria laudos/explicacao_telas_e_funcoes.pdf.</w:t>
             </w:r>
           </w:p>
         </w:tc>
@@ -1039,18 +1232,19 @@
       <w:tr>
         <w:tc>
           <w:tcPr>
-            <w:tcW w:type="dxa" w:w="2351"/>
+            <w:tcW w:type="dxa" w:w="1134"/>
             <w:shd w:val="clear" w:color="auto" w:fill="FFF2CC"/>
           </w:tcPr>
           <w:p>
             <w:pPr>
-              <w:spacing w:after="0"/>
+              <w:spacing w:after="0" w:before="0"/>
             </w:pPr>
             <w:r/>
             <w:r>
               <w:rPr>
-                <w:b w:val="0"/>
-                <w:sz w:val="18"/>
+                <w:rFonts w:ascii="Times New Roman" w:hAnsi="Times New Roman"/>
+                <w:b/>
+                <w:sz w:val="16"/>
               </w:rPr>
               <w:t>00aac9a</w:t>
             </w:r>
@@ -1058,39 +1252,57 @@
         </w:tc>
         <w:tc>
           <w:tcPr>
-            <w:tcW w:type="dxa" w:w="2351"/>
+            <w:tcW w:type="dxa" w:w="2041"/>
             <w:shd w:val="clear" w:color="auto" w:fill="FFF2CC"/>
           </w:tcPr>
           <w:p>
             <w:pPr>
-              <w:spacing w:after="0"/>
+              <w:spacing w:after="0" w:before="0"/>
             </w:pPr>
             <w:r/>
             <w:r>
               <w:rPr>
+                <w:rFonts w:ascii="Times New Roman" w:hAnsi="Times New Roman"/>
                 <w:b w:val="0"/>
-                <w:sz w:val="18"/>
+                <w:sz w:val="16"/>
               </w:rPr>
-              <w:t>21/10/2026 11:43</w:t>
+              <w:t>21/10/2026 08:43</w:t>
               <w:br/>
-              <w:t>Cursor Agent (IA) + José Eduardo</w:t>
+            </w:r>
+            <w:r>
+              <w:rPr>
+                <w:rFonts w:ascii="Times New Roman" w:hAnsi="Times New Roman"/>
+                <w:b w:val="0"/>
+                <w:sz w:val="16"/>
+              </w:rPr>
+              <w:t>Cursor Agent; coautor José Eduardo</w:t>
             </w:r>
           </w:p>
         </w:tc>
         <w:tc>
           <w:tcPr>
-            <w:tcW w:type="dxa" w:w="2351"/>
+            <w:tcW w:type="dxa" w:w="2381"/>
             <w:shd w:val="clear" w:color="auto" w:fill="FFF2CC"/>
           </w:tcPr>
           <w:p>
             <w:pPr>
-              <w:spacing w:after="0"/>
+              <w:spacing w:after="0" w:before="0"/>
             </w:pPr>
             <w:r/>
             <w:r>
               <w:rPr>
-                <w:b/>
-                <w:sz w:val="18"/>
+                <w:rFonts w:ascii="Times New Roman" w:hAnsi="Times New Roman"/>
+                <w:b w:val="0"/>
+                <w:sz w:val="16"/>
+              </w:rPr>
+              <w:t>cursor/corrigir-leitura-disco-2731</w:t>
+              <w:br/>
+            </w:r>
+            <w:r>
+              <w:rPr>
+                <w:rFonts w:ascii="Times New Roman" w:hAnsi="Times New Roman"/>
+                <w:b w:val="0"/>
+                <w:sz w:val="16"/>
               </w:rPr>
               <w:t>Adiciona laudo teste com as imagens do CronotaScan</w:t>
             </w:r>
@@ -1098,20 +1310,21 @@
         </w:tc>
         <w:tc>
           <w:tcPr>
-            <w:tcW w:type="dxa" w:w="2351"/>
+            <w:tcW w:type="dxa" w:w="3515"/>
             <w:shd w:val="clear" w:color="auto" w:fill="FFF2CC"/>
           </w:tcPr>
           <w:p>
             <w:pPr>
-              <w:spacing w:after="0"/>
+              <w:spacing w:after="0" w:before="0"/>
             </w:pPr>
             <w:r/>
             <w:r>
               <w:rPr>
+                <w:rFonts w:ascii="Times New Roman" w:hAnsi="Times New Roman"/>
                 <w:b w:val="0"/>
-                <w:sz w:val="18"/>
+                <w:sz w:val="16"/>
               </w:rPr>
-              <w:t>Laudo de teste completo com imagens do sistema incluídas para apresentação à professora (laudos/laudo_teste.pdf).</w:t>
+              <w:t>Cria laudos/laudo_teste.pdf.</w:t>
             </w:r>
           </w:p>
         </w:tc>
@@ -1119,18 +1332,19 @@
       <w:tr>
         <w:tc>
           <w:tcPr>
-            <w:tcW w:type="dxa" w:w="2351"/>
+            <w:tcW w:type="dxa" w:w="1134"/>
             <w:shd w:val="clear" w:color="auto" w:fill="FFF2CC"/>
           </w:tcPr>
           <w:p>
             <w:pPr>
-              <w:spacing w:after="0"/>
+              <w:spacing w:after="0" w:before="0"/>
             </w:pPr>
             <w:r/>
             <w:r>
               <w:rPr>
-                <w:b w:val="0"/>
-                <w:sz w:val="18"/>
+                <w:rFonts w:ascii="Times New Roman" w:hAnsi="Times New Roman"/>
+                <w:b/>
+                <w:sz w:val="16"/>
               </w:rPr>
               <w:t>8b438ca</w:t>
             </w:r>
@@ -1138,39 +1352,57 @@
         </w:tc>
         <w:tc>
           <w:tcPr>
-            <w:tcW w:type="dxa" w:w="2351"/>
+            <w:tcW w:type="dxa" w:w="2041"/>
             <w:shd w:val="clear" w:color="auto" w:fill="FFF2CC"/>
           </w:tcPr>
           <w:p>
             <w:pPr>
-              <w:spacing w:after="0"/>
+              <w:spacing w:after="0" w:before="0"/>
             </w:pPr>
             <w:r/>
             <w:r>
               <w:rPr>
+                <w:rFonts w:ascii="Times New Roman" w:hAnsi="Times New Roman"/>
                 <w:b w:val="0"/>
-                <w:sz w:val="18"/>
+                <w:sz w:val="16"/>
               </w:rPr>
-              <w:t>21/10/2026 11:49</w:t>
+              <w:t>21/10/2026 08:49</w:t>
               <w:br/>
-              <w:t>Cursor Agent (IA) + José Eduardo</w:t>
+            </w:r>
+            <w:r>
+              <w:rPr>
+                <w:rFonts w:ascii="Times New Roman" w:hAnsi="Times New Roman"/>
+                <w:b w:val="0"/>
+                <w:sz w:val="16"/>
+              </w:rPr>
+              <w:t>Cursor Agent; coautor José Eduardo</w:t>
             </w:r>
           </w:p>
         </w:tc>
         <w:tc>
           <w:tcPr>
-            <w:tcW w:type="dxa" w:w="2351"/>
+            <w:tcW w:type="dxa" w:w="2381"/>
             <w:shd w:val="clear" w:color="auto" w:fill="FFF2CC"/>
           </w:tcPr>
           <w:p>
             <w:pPr>
-              <w:spacing w:after="0"/>
+              <w:spacing w:after="0" w:before="0"/>
             </w:pPr>
             <w:r/>
             <w:r>
               <w:rPr>
-                <w:b/>
-                <w:sz w:val="18"/>
+                <w:rFonts w:ascii="Times New Roman" w:hAnsi="Times New Roman"/>
+                <w:b w:val="0"/>
+                <w:sz w:val="16"/>
+              </w:rPr>
+              <w:t>cursor/corrigir-leitura-disco-2731</w:t>
+              <w:br/>
+            </w:r>
+            <w:r>
+              <w:rPr>
+                <w:rFonts w:ascii="Times New Roman" w:hAnsi="Times New Roman"/>
+                <w:b w:val="0"/>
+                <w:sz w:val="16"/>
               </w:rPr>
               <w:t>Reescreve o laudo teste com a explicação de cada tela e função</w:t>
             </w:r>
@@ -1178,20 +1410,21 @@
         </w:tc>
         <w:tc>
           <w:tcPr>
-            <w:tcW w:type="dxa" w:w="2351"/>
+            <w:tcW w:type="dxa" w:w="3515"/>
             <w:shd w:val="clear" w:color="auto" w:fill="FFF2CC"/>
           </w:tcPr>
           <w:p>
             <w:pPr>
-              <w:spacing w:after="0"/>
+              <w:spacing w:after="0" w:before="0"/>
             </w:pPr>
             <w:r/>
             <w:r>
               <w:rPr>
+                <w:rFonts w:ascii="Times New Roman" w:hAnsi="Times New Roman"/>
                 <w:b w:val="0"/>
-                <w:sz w:val="18"/>
+                <w:sz w:val="16"/>
               </w:rPr>
-              <w:t>Revisão completa do laudo de teste: cada tela e função do sistema descrita individualmente com clareza para a banca.</w:t>
+              <w:t>Reescreve laudos/laudo_teste.pdf descrevendo cada tela e função.</w:t>
             </w:r>
           </w:p>
         </w:tc>
@@ -1199,18 +1432,19 @@
       <w:tr>
         <w:tc>
           <w:tcPr>
-            <w:tcW w:type="dxa" w:w="2351"/>
-            <w:shd w:val="clear" w:color="auto" w:fill="FFFFFF"/>
+            <w:tcW w:type="dxa" w:w="1134"/>
+            <w:shd w:val="clear" w:color="auto" w:fill="FFF2CC"/>
           </w:tcPr>
           <w:p>
             <w:pPr>
-              <w:spacing w:after="0"/>
+              <w:spacing w:after="0" w:before="0"/>
             </w:pPr>
             <w:r/>
             <w:r>
               <w:rPr>
-                <w:b w:val="0"/>
-                <w:sz w:val="18"/>
+                <w:rFonts w:ascii="Times New Roman" w:hAnsi="Times New Roman"/>
+                <w:b/>
+                <w:sz w:val="16"/>
               </w:rPr>
               <w:t>9842a38</w:t>
             </w:r>
@@ -1218,39 +1452,57 @@
         </w:tc>
         <w:tc>
           <w:tcPr>
-            <w:tcW w:type="dxa" w:w="2351"/>
-            <w:shd w:val="clear" w:color="auto" w:fill="FFFFFF"/>
+            <w:tcW w:type="dxa" w:w="2041"/>
+            <w:shd w:val="clear" w:color="auto" w:fill="FFF2CC"/>
           </w:tcPr>
           <w:p>
             <w:pPr>
-              <w:spacing w:after="0"/>
+              <w:spacing w:after="0" w:before="0"/>
             </w:pPr>
             <w:r/>
             <w:r>
               <w:rPr>
+                <w:rFonts w:ascii="Times New Roman" w:hAnsi="Times New Roman"/>
                 <w:b w:val="0"/>
-                <w:sz w:val="18"/>
+                <w:sz w:val="16"/>
               </w:rPr>
               <w:t>23/10/2026 09:17</w:t>
               <w:br/>
-              <w:t>José Eduardo (jbr121)</w:t>
+            </w:r>
+            <w:r>
+              <w:rPr>
+                <w:rFonts w:ascii="Times New Roman" w:hAnsi="Times New Roman"/>
+                <w:b w:val="0"/>
+                <w:sz w:val="16"/>
+              </w:rPr>
+              <w:t>José Eduardo (jbr121), aplicando o Cloud Agent</w:t>
             </w:r>
           </w:p>
         </w:tc>
         <w:tc>
           <w:tcPr>
-            <w:tcW w:type="dxa" w:w="2351"/>
-            <w:shd w:val="clear" w:color="auto" w:fill="FFFFFF"/>
+            <w:tcW w:type="dxa" w:w="2381"/>
+            <w:shd w:val="clear" w:color="auto" w:fill="FFF2CC"/>
           </w:tcPr>
           <w:p>
             <w:pPr>
-              <w:spacing w:after="0"/>
+              <w:spacing w:after="0" w:before="0"/>
             </w:pPr>
             <w:r/>
             <w:r>
               <w:rPr>
-                <w:b/>
-                <w:sz w:val="18"/>
+                <w:rFonts w:ascii="Times New Roman" w:hAnsi="Times New Roman"/>
+                <w:b w:val="0"/>
+                <w:sz w:val="16"/>
+              </w:rPr>
+              <w:t>cursor/cloud-agent-1792757833804-ojiac</w:t>
+              <w:br/>
+            </w:r>
+            <w:r>
+              <w:rPr>
+                <w:rFonts w:ascii="Times New Roman" w:hAnsi="Times New Roman"/>
+                <w:b w:val="0"/>
+                <w:sz w:val="16"/>
               </w:rPr>
               <w:t>Cursor: Apply local changes for cloud agent</w:t>
             </w:r>
@@ -1258,20 +1510,21 @@
         </w:tc>
         <w:tc>
           <w:tcPr>
-            <w:tcW w:type="dxa" w:w="2351"/>
-            <w:shd w:val="clear" w:color="auto" w:fill="FFFFFF"/>
+            <w:tcW w:type="dxa" w:w="3515"/>
+            <w:shd w:val="clear" w:color="auto" w:fill="FFF2CC"/>
           </w:tcPr>
           <w:p>
             <w:pPr>
-              <w:spacing w:after="0"/>
+              <w:spacing w:after="0" w:before="0"/>
             </w:pPr>
             <w:r/>
             <w:r>
               <w:rPr>
+                <w:rFonts w:ascii="Times New Roman" w:hAnsi="Times New Roman"/>
                 <w:b w:val="0"/>
-                <w:sz w:val="18"/>
+                <w:sz w:val="16"/>
               </w:rPr>
-              <w:t>Sincronização de alterações locais com o agente na nuvem do Cursor.</w:t>
+              <w:t>Commit feito por José Eduardo com a mensagem padrão do Cursor ao aplicar o agente. 36 arquivos, +5143/−253. Entra aqui o código de visão, testes e os documentos da disciplina gerados com o agente: M1, Lean Inception, Definição do PGI, respostas das atividades de testes, relatório e roteiro do M2, mais os scripts docs/gerar_*.py. Esta branch sai do commit 23957bb e ainda não está no master.</w:t>
             </w:r>
           </w:p>
         </w:tc>
@@ -1279,18 +1532,19 @@
       <w:tr>
         <w:tc>
           <w:tcPr>
-            <w:tcW w:type="dxa" w:w="2351"/>
+            <w:tcW w:type="dxa" w:w="1134"/>
             <w:shd w:val="clear" w:color="auto" w:fill="FFF2CC"/>
           </w:tcPr>
           <w:p>
             <w:pPr>
-              <w:spacing w:after="0"/>
+              <w:spacing w:after="0" w:before="0"/>
             </w:pPr>
             <w:r/>
             <w:r>
               <w:rPr>
-                <w:b w:val="0"/>
-                <w:sz w:val="18"/>
+                <w:rFonts w:ascii="Times New Roman" w:hAnsi="Times New Roman"/>
+                <w:b/>
+                <w:sz w:val="16"/>
               </w:rPr>
               <w:t>e72dcc8</w:t>
             </w:r>
@@ -1298,39 +1552,57 @@
         </w:tc>
         <w:tc>
           <w:tcPr>
-            <w:tcW w:type="dxa" w:w="2351"/>
+            <w:tcW w:type="dxa" w:w="2041"/>
             <w:shd w:val="clear" w:color="auto" w:fill="FFF2CC"/>
           </w:tcPr>
           <w:p>
             <w:pPr>
-              <w:spacing w:after="0"/>
+              <w:spacing w:after="0" w:before="0"/>
             </w:pPr>
             <w:r/>
             <w:r>
               <w:rPr>
+                <w:rFonts w:ascii="Times New Roman" w:hAnsi="Times New Roman"/>
                 <w:b w:val="0"/>
-                <w:sz w:val="18"/>
+                <w:sz w:val="16"/>
               </w:rPr>
-              <w:t>23/10/2026 12:20</w:t>
+              <w:t>23/10/2026 09:20</w:t>
               <w:br/>
-              <w:t>Cursor Agent (IA)</w:t>
+            </w:r>
+            <w:r>
+              <w:rPr>
+                <w:rFonts w:ascii="Times New Roman" w:hAnsi="Times New Roman"/>
+                <w:b w:val="0"/>
+                <w:sz w:val="16"/>
+              </w:rPr>
+              <w:t>Cursor Agent; coautor José Eduardo</w:t>
             </w:r>
           </w:p>
         </w:tc>
         <w:tc>
           <w:tcPr>
-            <w:tcW w:type="dxa" w:w="2351"/>
+            <w:tcW w:type="dxa" w:w="2381"/>
             <w:shd w:val="clear" w:color="auto" w:fill="FFF2CC"/>
           </w:tcPr>
           <w:p>
             <w:pPr>
-              <w:spacing w:after="0"/>
+              <w:spacing w:after="0" w:before="0"/>
             </w:pPr>
             <w:r/>
             <w:r>
               <w:rPr>
-                <w:b/>
-                <w:sz w:val="18"/>
+                <w:rFonts w:ascii="Times New Roman" w:hAnsi="Times New Roman"/>
+                <w:b w:val="0"/>
+                <w:sz w:val="16"/>
+              </w:rPr>
+              <w:t>cursor/declaracao-uso-ia-1680</w:t>
+              <w:br/>
+            </w:r>
+            <w:r>
+              <w:rPr>
+                <w:rFonts w:ascii="Times New Roman" w:hAnsi="Times New Roman"/>
+                <w:b w:val="0"/>
+                <w:sz w:val="16"/>
               </w:rPr>
               <w:t>docs: adiciona documento de declaração de uso de IA (para entrega M2)</w:t>
             </w:r>
@@ -1338,20 +1610,121 @@
         </w:tc>
         <w:tc>
           <w:tcPr>
-            <w:tcW w:type="dxa" w:w="2351"/>
+            <w:tcW w:type="dxa" w:w="3515"/>
             <w:shd w:val="clear" w:color="auto" w:fill="FFF2CC"/>
           </w:tcPr>
           <w:p>
             <w:pPr>
-              <w:spacing w:after="0"/>
+              <w:spacing w:after="0" w:before="0"/>
             </w:pPr>
             <w:r/>
             <w:r>
               <w:rPr>
+                <w:rFonts w:ascii="Times New Roman" w:hAnsi="Times New Roman"/>
                 <w:b w:val="0"/>
-                <w:sz w:val="18"/>
+                <w:sz w:val="16"/>
               </w:rPr>
-              <w:t>Criação deste próprio documento de declaração de uso de IA, conforme solicitado pela professora.</w:t>
+              <w:t>Primeira versão deste documento e do script docs/gerar_uso_ia.py.</w:t>
+            </w:r>
+          </w:p>
+        </w:tc>
+      </w:tr>
+      <w:tr>
+        <w:tc>
+          <w:tcPr>
+            <w:tcW w:type="dxa" w:w="1134"/>
+            <w:shd w:val="clear" w:color="auto" w:fill="FFF2CC"/>
+          </w:tcPr>
+          <w:p>
+            <w:pPr>
+              <w:spacing w:after="0" w:before="0"/>
+            </w:pPr>
+            <w:r/>
+            <w:r>
+              <w:rPr>
+                <w:rFonts w:ascii="Times New Roman" w:hAnsi="Times New Roman"/>
+                <w:b/>
+                <w:sz w:val="16"/>
+              </w:rPr>
+              <w:t>c392737</w:t>
+            </w:r>
+          </w:p>
+        </w:tc>
+        <w:tc>
+          <w:tcPr>
+            <w:tcW w:type="dxa" w:w="2041"/>
+            <w:shd w:val="clear" w:color="auto" w:fill="FFF2CC"/>
+          </w:tcPr>
+          <w:p>
+            <w:pPr>
+              <w:spacing w:after="0" w:before="0"/>
+            </w:pPr>
+            <w:r/>
+            <w:r>
+              <w:rPr>
+                <w:rFonts w:ascii="Times New Roman" w:hAnsi="Times New Roman"/>
+                <w:b w:val="0"/>
+                <w:sz w:val="16"/>
+              </w:rPr>
+              <w:t>23/10/2026 09:23</w:t>
+              <w:br/>
+            </w:r>
+            <w:r>
+              <w:rPr>
+                <w:rFonts w:ascii="Times New Roman" w:hAnsi="Times New Roman"/>
+                <w:b w:val="0"/>
+                <w:sz w:val="16"/>
+              </w:rPr>
+              <w:t>Cursor Agent; coautor José Eduardo</w:t>
+            </w:r>
+          </w:p>
+        </w:tc>
+        <w:tc>
+          <w:tcPr>
+            <w:tcW w:type="dxa" w:w="2381"/>
+            <w:shd w:val="clear" w:color="auto" w:fill="FFF2CC"/>
+          </w:tcPr>
+          <w:p>
+            <w:pPr>
+              <w:spacing w:after="0" w:before="0"/>
+            </w:pPr>
+            <w:r/>
+            <w:r>
+              <w:rPr>
+                <w:rFonts w:ascii="Times New Roman" w:hAnsi="Times New Roman"/>
+                <w:b w:val="0"/>
+                <w:sz w:val="16"/>
+              </w:rPr>
+              <w:t>cursor/declaracao-uso-ia-1680</w:t>
+              <w:br/>
+            </w:r>
+            <w:r>
+              <w:rPr>
+                <w:rFonts w:ascii="Times New Roman" w:hAnsi="Times New Roman"/>
+                <w:b w:val="0"/>
+                <w:sz w:val="16"/>
+              </w:rPr>
+              <w:t>docs: reescreve declaração de uso de IA com tabela completa de commits</w:t>
+            </w:r>
+          </w:p>
+        </w:tc>
+        <w:tc>
+          <w:tcPr>
+            <w:tcW w:type="dxa" w:w="3515"/>
+            <w:shd w:val="clear" w:color="auto" w:fill="FFF2CC"/>
+          </w:tcPr>
+          <w:p>
+            <w:pPr>
+              <w:spacing w:after="0" w:before="0"/>
+            </w:pPr>
+            <w:r/>
+            <w:r>
+              <w:rPr>
+                <w:rFonts w:ascii="Times New Roman" w:hAnsi="Times New Roman"/>
+                <w:b w:val="0"/>
+                <w:sz w:val="16"/>
+              </w:rPr>
+              <w:t>Segunda versão deste documento. Ainda trazia horários em UTC e classificava o commit 9842a38 como se não tivesse IA.</w:t>
             </w:r>
           </w:p>
         </w:tc>
@@ -1359,54 +1732,26 @@
     </w:tbl>
     <w:p/>
     <w:p>
+      <w:pPr>
+        <w:spacing w:after="120" w:line="276" w:lineRule="auto"/>
+        <w:jc w:val="both"/>
+      </w:pPr>
       <w:r>
         <w:rPr>
-          <w:b/>
-          <w:sz w:val="20"/>
+          <w:rFonts w:ascii="Times New Roman" w:hAnsi="Times New Roman"/>
+          <w:b w:val="0"/>
+          <w:sz w:val="22"/>
         </w:rPr>
-        <w:t xml:space="preserve">Legenda: </w:t>
-      </w:r>
-      <w:r>
-        <w:rPr>
-          <w:sz w:val="20"/>
-        </w:rPr>
-        <w:t xml:space="preserve">Fundo </w:t>
-      </w:r>
-      <w:r>
-        <w:rPr>
-          <w:b/>
-          <w:sz w:val="20"/>
-        </w:rPr>
-        <w:t>amarelo</w:t>
-      </w:r>
-      <w:r>
-        <w:rPr>
-          <w:sz w:val="20"/>
-        </w:rPr>
-        <w:t xml:space="preserve"> = commit com auxílio de IA.  Fundo </w:t>
-      </w:r>
-      <w:r>
-        <w:rPr>
-          <w:b/>
-          <w:sz w:val="20"/>
-        </w:rPr>
-        <w:t>branco</w:t>
-      </w:r>
-      <w:r>
-        <w:rPr>
-          <w:sz w:val="20"/>
-        </w:rPr>
-        <w:t xml:space="preserve"> = commit somente da equipe.</w:t>
+        <w:t>Legenda: fundo amarelo = commit com IA registrada no Git ou com a mensagem de aplicação do cloud agent. Fundo branco = commit somente da equipe.</w:t>
       </w:r>
     </w:p>
-    <w:p/>
     <w:p>
       <w:pPr>
         <w:pStyle w:val="Heading2"/>
-        <w:spacing w:before="280" w:after="120"/>
+        <w:spacing w:before="240" w:after="120"/>
       </w:pPr>
       <w:r>
-        <w:t>4. Detalhamento do Uso de IA por Área do Projeto</w:t>
+        <w:t>4. Onde a IA entrou, com o commit correspondente</w:t>
       </w:r>
     </w:p>
     <w:p>
@@ -1414,117 +1759,33 @@
         <w:pStyle w:val="Heading3"/>
       </w:pPr>
       <w:r>
-        <w:t>4.1 Pipeline de Visão Computacional (core/processador_imagem.py)</w:t>
-      </w:r>
-    </w:p>
-    <w:p>
-      <w:pPr>
-        <w:spacing w:after="120"/>
-        <w:jc w:val="both"/>
-      </w:pPr>
-      <w:r>
-        <w:rPr>
-          <w:b w:val="0"/>
-          <w:sz w:val="24"/>
-        </w:rPr>
-        <w:t>A parte mais complexa do sistema é o pipeline OpenCV que transforma a foto do disco analógico em uma curva de velocidade × tempo. A IA foi utilizada para:</w:t>
+        <w:t>4.1 Leitura do disco</w:t>
       </w:r>
     </w:p>
     <w:p>
       <w:pPr>
         <w:pStyle w:val="ListBullet"/>
-        <w:spacing w:after="80"/>
+        <w:spacing w:after="60"/>
       </w:pPr>
       <w:r>
         <w:rPr>
+          <w:rFonts w:ascii="Times New Roman" w:hAnsi="Times New Roman"/>
           <w:sz w:val="24"/>
         </w:rPr>
-        <w:t>Propor o uso de cv2.fitEllipse para detectar a borda do disco mesmo em fotos inclinadas.</w:t>
+        <w:t>b3454bb (master, 25/09/2026): leitor v2 com elipse, homografia, arco verde e autocalibração. Modelo declarado: Claude Opus 5.5. Autor humano: Erick.</w:t>
       </w:r>
     </w:p>
     <w:p>
       <w:pPr>
         <w:pStyle w:val="ListBullet"/>
-        <w:spacing w:after="80"/>
+        <w:spacing w:after="60"/>
       </w:pPr>
       <w:r>
         <w:rPr>
+          <w:rFonts w:ascii="Times New Roman" w:hAnsi="Times New Roman"/>
           <w:sz w:val="24"/>
         </w:rPr>
-        <w:t>Desenvolver a homografia que corrige a perspectiva da foto (elipse → círculo perfeito).</w:t>
-      </w:r>
-    </w:p>
-    <w:p>
-      <w:pPr>
-        <w:pStyle w:val="ListBullet"/>
-        <w:spacing w:after="80"/>
-      </w:pPr>
-      <w:r>
-        <w:rPr>
-          <w:sz w:val="24"/>
-        </w:rPr>
-        <w:t>Sugerir cv2.warpPolar para o desdobramento polar (disco circular → imagem retangular).</w:t>
-      </w:r>
-    </w:p>
-    <w:p>
-      <w:pPr>
-        <w:pStyle w:val="ListBullet"/>
-        <w:spacing w:after="80"/>
-      </w:pPr>
-      <w:r>
-        <w:rPr>
-          <w:sz w:val="24"/>
-        </w:rPr>
-        <w:t>Criar a lógica de máscara HSV para isolar o papel branco do disco e ignorar o mousepad colorido de fundo.</w:t>
-      </w:r>
-    </w:p>
-    <w:p>
-      <w:pPr>
-        <w:pStyle w:val="ListBullet"/>
-        <w:spacing w:after="80"/>
-      </w:pPr>
-      <w:r>
-        <w:rPr>
-          <w:sz w:val="24"/>
-        </w:rPr>
-        <w:t>Implementar a autocalibração pelos anéis tracejados impressos (20, 40, 60, 80, 100 km/h).</w:t>
-      </w:r>
-    </w:p>
-    <w:p>
-      <w:pPr>
-        <w:pStyle w:val="ListBullet"/>
-        <w:spacing w:after="80"/>
-      </w:pPr>
-      <w:r>
-        <w:rPr>
-          <w:sz w:val="24"/>
-        </w:rPr>
-        <w:t>Criar a detecção da barra de atividade para ler velocidade somente nos minutos em que o caminhão está em movimento.</w:t>
-      </w:r>
-    </w:p>
-    <w:p>
-      <w:pPr>
-        <w:pStyle w:val="ListBullet"/>
-        <w:spacing w:after="80"/>
-      </w:pPr>
-      <w:r>
-        <w:rPr>
-          <w:sz w:val="24"/>
-        </w:rPr>
-        <w:t>Implementar a orientação pelo arco verde 12h–24h impresso na borda do disco.</w:t>
-      </w:r>
-    </w:p>
-    <w:p>
-      <w:pPr>
-        <w:spacing w:after="120"/>
-        <w:jc w:val="both"/>
-      </w:pPr>
-      <w:r>
-        <w:rPr>
-          <w:b w:val="0"/>
-          <w:sz w:val="24"/>
-        </w:rPr>
-        <w:t>Commits relacionados: b3454bb (25/09/2026), 10090b4 (09/10/2026), 634c6db (21/10/2026). Em todos, a equipe revisou o código gerado, ajustou os parâmetros com fotos reais dos discos e validou os resultados manualmente.</w:t>
+        <w:t>10090b4 e 634c6db (branch cursor/corrigir-leitura-disco-2731): correção do rastreamento da curva e calibração com discos de gabarito. Autor Git: Cursor Agent.</w:t>
       </w:r>
     </w:p>
     <w:p>
@@ -1532,69 +1793,46 @@
         <w:pStyle w:val="Heading3"/>
       </w:pPr>
       <w:r>
-        <w:t>4.2 Testes Automatizados</w:t>
-      </w:r>
-    </w:p>
-    <w:p>
-      <w:pPr>
-        <w:spacing w:after="120"/>
-        <w:jc w:val="both"/>
-      </w:pPr>
-      <w:r>
-        <w:rPr>
-          <w:b w:val="0"/>
-          <w:sz w:val="24"/>
-        </w:rPr>
-        <w:t>Os testes unitários e de fixtures foram elaborados com suporte da IA:</w:t>
+        <w:t>4.2 Testes</w:t>
       </w:r>
     </w:p>
     <w:p>
       <w:pPr>
         <w:pStyle w:val="ListBullet"/>
-        <w:spacing w:after="80"/>
+        <w:spacing w:after="60"/>
       </w:pPr>
       <w:r>
         <w:rPr>
+          <w:rFonts w:ascii="Times New Roman" w:hAnsi="Times New Roman"/>
           <w:sz w:val="24"/>
         </w:rPr>
-        <w:t>tests/test_processador_imagem.py — testes do pipeline principal (commit 10090b4).</w:t>
+        <w:t>10090b4 cria tests/test_processador_imagem.py.</w:t>
       </w:r>
     </w:p>
     <w:p>
       <w:pPr>
         <w:pStyle w:val="ListBullet"/>
-        <w:spacing w:after="80"/>
+        <w:spacing w:after="60"/>
       </w:pPr>
       <w:r>
         <w:rPr>
+          <w:rFonts w:ascii="Times New Roman" w:hAnsi="Times New Roman"/>
           <w:sz w:val="24"/>
         </w:rPr>
-        <w:t>tests/discos_sinteticos.py — geração de discos sintéticos com OpenCV (reto, inclinado, com lacuna).</w:t>
+        <w:t>634c6db cria os discos sintéticos, o gabarito JSON e tests/test_fixtures_disco.py.</w:t>
       </w:r>
     </w:p>
     <w:p>
       <w:pPr>
         <w:pStyle w:val="ListBullet"/>
-        <w:spacing w:after="80"/>
+        <w:spacing w:after="60"/>
       </w:pPr>
       <w:r>
         <w:rPr>
+          <w:rFonts w:ascii="Times New Roman" w:hAnsi="Times New Roman"/>
           <w:sz w:val="24"/>
         </w:rPr>
-        <w:t>tests/test_fixtures_disco.py — comparação de resultados com gabarito JSON (commit 634c6db).</w:t>
-      </w:r>
-    </w:p>
-    <w:p>
-      <w:pPr>
-        <w:spacing w:after="120"/>
-        <w:jc w:val="both"/>
-      </w:pPr>
-      <w:r>
-        <w:rPr>
-          <w:b w:val="0"/>
-          <w:sz w:val="24"/>
-        </w:rPr>
-        <w:t>A equipe definiu os cenários e critérios de aceite; a IA traduziu esses cenários em código.</w:t>
+        <w:t>9842a38 cria tests/test_pipeline.py e tests/test_analisador.py na branch do cloud agent.</w:t>
       </w:r>
     </w:p>
     <w:p>
@@ -1602,43 +1840,34 @@
         <w:pStyle w:val="Heading3"/>
       </w:pPr>
       <w:r>
-        <w:t>4.3 Laudos e PDFs</w:t>
+        <w:t>4.3 Laudos em PDF</w:t>
       </w:r>
     </w:p>
     <w:p>
       <w:pPr>
         <w:pStyle w:val="ListBullet"/>
-        <w:spacing w:after="80"/>
+        <w:spacing w:after="60"/>
       </w:pPr>
       <w:r>
         <w:rPr>
+          <w:rFonts w:ascii="Times New Roman" w:hAnsi="Times New Roman"/>
           <w:sz w:val="24"/>
         </w:rPr>
-        <w:t>laudos/laudo_discos_gabarito.pdf — laudo dos discos de gabarito (commit 920e257).</w:t>
+        <w:t>920e257, b6abd2f, 306196e, 00aac9a e 8b438ca geram e reescrevem os PDFs em laudos/.</w:t>
       </w:r>
     </w:p>
     <w:p>
       <w:pPr>
-        <w:pStyle w:val="ListBullet"/>
-        <w:spacing w:after="80"/>
+        <w:spacing w:after="120" w:line="276" w:lineRule="auto"/>
+        <w:jc w:val="both"/>
       </w:pPr>
       <w:r>
         <w:rPr>
+          <w:rFonts w:ascii="Times New Roman" w:hAnsi="Times New Roman"/>
+          <w:b w:val="0"/>
           <w:sz w:val="24"/>
         </w:rPr>
-        <w:t>laudos/explicacao_telas_e_funcoes.pdf — PDF com todas as telas e funções (commit 306196e).</w:t>
-      </w:r>
-    </w:p>
-    <w:p>
-      <w:pPr>
-        <w:pStyle w:val="ListBullet"/>
-        <w:spacing w:after="80"/>
-      </w:pPr>
-      <w:r>
-        <w:rPr>
-          <w:sz w:val="24"/>
-        </w:rPr>
-        <w:t>laudos/laudo_teste.pdf — laudo completo com imagens do sistema (commits 00aac9a e 8b438ca).</w:t>
+        <w:t>Esses arquivos estão na branch cursor/corrigir-leitura-disco-2731. Eles não estão no master.</w:t>
       </w:r>
     </w:p>
     <w:p>
@@ -1646,182 +1875,169 @@
         <w:pStyle w:val="Heading3"/>
       </w:pPr>
       <w:r>
-        <w:t>4.4 Documentação Acadêmica</w:t>
+        <w:t>4.4 Documentos da disciplina</w:t>
       </w:r>
     </w:p>
     <w:p>
       <w:pPr>
-        <w:spacing w:after="120"/>
+        <w:spacing w:after="120" w:line="276" w:lineRule="auto"/>
         <w:jc w:val="both"/>
       </w:pPr>
       <w:r>
         <w:rPr>
+          <w:rFonts w:ascii="Times New Roman" w:hAnsi="Times New Roman"/>
           <w:b w:val="0"/>
           <w:sz w:val="24"/>
         </w:rPr>
-        <w:t>A IA auxiliou na redação e formatação dos seguintes documentos entregues na disciplina:</w:t>
+        <w:t>Os documentos pedidos na disciplina foram gerados com o Cloud Agent e entraram no Git no commit 9842a38, branch cursor/cloud-agent-1792757833804-ojiac, em 23/10/2026 às 09:17 (horário de São Paulo). Não estão no master.</w:t>
       </w:r>
     </w:p>
     <w:p>
       <w:pPr>
         <w:pStyle w:val="ListBullet"/>
-        <w:spacing w:after="80"/>
+        <w:spacing w:after="60"/>
       </w:pPr>
       <w:r>
         <w:rPr>
+          <w:rFonts w:ascii="Times New Roman" w:hAnsi="Times New Roman"/>
           <w:sz w:val="24"/>
         </w:rPr>
-        <w:t>M1 — Visão, Arquitetura e Planejamento do CronotaScan (Word + diagramas UML em PNG).</w:t>
+        <w:t>docs/M1_Visao_Arquitetura_CronotaScan.docx e docs/gerar_m1_docx.py, com as figuras em docs/figuras/.</w:t>
       </w:r>
     </w:p>
     <w:p>
       <w:pPr>
         <w:pStyle w:val="ListBullet"/>
-        <w:spacing w:after="80"/>
+        <w:spacing w:after="60"/>
       </w:pPr>
       <w:r>
         <w:rPr>
+          <w:rFonts w:ascii="Times New Roman" w:hAnsi="Times New Roman"/>
           <w:sz w:val="24"/>
         </w:rPr>
-        <w:t>Lean Inception — Visão do produto, É/Não é / Faz/Não faz e 3 objetivos principais.</w:t>
+        <w:t>docs/Lean_Inception_CronotaScan.docx e docs/gerar_lean_inception.py.</w:t>
       </w:r>
     </w:p>
     <w:p>
       <w:pPr>
         <w:pStyle w:val="ListBullet"/>
-        <w:spacing w:after="80"/>
+        <w:spacing w:after="60"/>
       </w:pPr>
       <w:r>
         <w:rPr>
+          <w:rFonts w:ascii="Times New Roman" w:hAnsi="Times New Roman"/>
           <w:sz w:val="24"/>
         </w:rPr>
-        <w:t>Definição do Projeto Integrador (PGI) — escopo, cronograma e riscos.</w:t>
+        <w:t>docs/Definicao_Projeto_Integrador_CronotaScan.docx e docs/gerar_definicao_pgi.py.</w:t>
       </w:r>
     </w:p>
     <w:p>
       <w:pPr>
         <w:pStyle w:val="ListBullet"/>
-        <w:spacing w:after="80"/>
+        <w:spacing w:after="60"/>
       </w:pPr>
       <w:r>
         <w:rPr>
+          <w:rFonts w:ascii="Times New Roman" w:hAnsi="Times New Roman"/>
           <w:sz w:val="24"/>
         </w:rPr>
-        <w:t>Atividade de Testes (partes 1 e 2) — respostas às questões teóricas em linguagem simples.</w:t>
+        <w:t>docs/Respostas_Atividade_Testes.docx, a versão em linguagem simples e a parte 2, com os scripts gerar_respostas_testes.py.</w:t>
       </w:r>
     </w:p>
     <w:p>
       <w:pPr>
         <w:pStyle w:val="ListBullet"/>
-        <w:spacing w:after="80"/>
+        <w:spacing w:after="60"/>
       </w:pPr>
       <w:r>
         <w:rPr>
+          <w:rFonts w:ascii="Times New Roman" w:hAnsi="Times New Roman"/>
           <w:sz w:val="24"/>
         </w:rPr>
-        <w:t>M2 — Relatório de progresso e roteiro de apresentação oral.</w:t>
+        <w:t>docs/M2_Relatorio_CronotaScan.docx, docs/M2_Roteiro_Apresentacao_CronotaScan.docx e docs/gerar_m2_relatorio.py.</w:t>
       </w:r>
     </w:p>
     <w:p>
       <w:pPr>
         <w:pStyle w:val="ListBullet"/>
-        <w:spacing w:after="80"/>
+        <w:spacing w:after="60"/>
       </w:pPr>
       <w:r>
         <w:rPr>
+          <w:rFonts w:ascii="Times New Roman" w:hAnsi="Times New Roman"/>
           <w:sz w:val="24"/>
         </w:rPr>
-        <w:t>Este documento — Declaração de Uso de IA (commit e72dcc8, 23/10/2026).</w:t>
+        <w:t>Este documento: commits e72dcc8 e c392737, branch cursor/declaracao-uso-ia-1680.</w:t>
       </w:r>
     </w:p>
     <w:p>
       <w:pPr>
         <w:pStyle w:val="Heading2"/>
-        <w:spacing w:before="280" w:after="120"/>
+        <w:spacing w:before="240" w:after="120"/>
       </w:pPr>
       <w:r>
-        <w:t>5. O Que NÃO Foi Feito pela IA</w:t>
+        <w:t>5. O que a equipe fez sem IA</w:t>
       </w:r>
     </w:p>
     <w:p>
       <w:pPr>
         <w:pStyle w:val="ListBullet"/>
-        <w:spacing w:after="80"/>
+        <w:spacing w:after="60"/>
       </w:pPr>
       <w:r>
         <w:rPr>
+          <w:rFonts w:ascii="Times New Roman" w:hAnsi="Times New Roman"/>
           <w:sz w:val="24"/>
         </w:rPr>
-        <w:t>Coleta e digitalização das fotos reais de discos de cronotacógrafo.</w:t>
+        <w:t>Commits a30940f, b6438e2 e 23957bb: base do projeto, tutorial de laboratório e documentação de ES2.</w:t>
       </w:r>
     </w:p>
     <w:p>
       <w:pPr>
         <w:pStyle w:val="ListBullet"/>
-        <w:spacing w:after="80"/>
+        <w:spacing w:after="60"/>
       </w:pPr>
       <w:r>
         <w:rPr>
+          <w:rFonts w:ascii="Times New Roman" w:hAnsi="Times New Roman"/>
           <w:sz w:val="24"/>
         </w:rPr>
-        <w:t>Definição dos requisitos funcionais junto ao orientador/professor.</w:t>
+        <w:t>Escolha da arquitetura (FastAPI, SQLite e página única) e dos requisitos com o professor.</w:t>
       </w:r>
     </w:p>
     <w:p>
       <w:pPr>
         <w:pStyle w:val="ListBullet"/>
-        <w:spacing w:after="80"/>
+        <w:spacing w:after="60"/>
       </w:pPr>
       <w:r>
         <w:rPr>
+          <w:rFonts w:ascii="Times New Roman" w:hAnsi="Times New Roman"/>
           <w:sz w:val="24"/>
         </w:rPr>
-        <w:t>Validação dos resultados do pipeline contra laudos reais (comparação manual de km e velocidade).</w:t>
+        <w:t>Fotos reais dos discos e a conferência manual do que o programa leu.</w:t>
       </w:r>
     </w:p>
     <w:p>
       <w:pPr>
         <w:pStyle w:val="ListBullet"/>
-        <w:spacing w:after="80"/>
+        <w:spacing w:after="60"/>
       </w:pPr>
       <w:r>
         <w:rPr>
+          <w:rFonts w:ascii="Times New Roman" w:hAnsi="Times New Roman"/>
           <w:sz w:val="24"/>
         </w:rPr>
-        <w:t>Decisões de arquitetura: escolha de FastAPI, SQLite, SPA HTML/JS puro.</w:t>
-      </w:r>
-    </w:p>
-    <w:p>
-      <w:pPr>
-        <w:pStyle w:val="ListBullet"/>
-        <w:spacing w:after="80"/>
-      </w:pPr>
-      <w:r>
-        <w:rPr>
-          <w:sz w:val="24"/>
-        </w:rPr>
-        <w:t>Apresentação oral do projeto para a banca.</w:t>
-      </w:r>
-    </w:p>
-    <w:p>
-      <w:pPr>
-        <w:pStyle w:val="ListBullet"/>
-        <w:spacing w:after="80"/>
-      </w:pPr>
-      <w:r>
-        <w:rPr>
-          <w:sz w:val="24"/>
-        </w:rPr>
-        <w:t>Estrutura inicial do projeto (commit a30940f — Initial commit, feito exclusivamente pela equipe).</w:t>
+        <w:t>Apresentação oral. Márcio Fossa participa do grupo mesmo sem commit no GitHub.</w:t>
       </w:r>
     </w:p>
     <w:p>
       <w:pPr>
         <w:pStyle w:val="Heading2"/>
-        <w:spacing w:before="280" w:after="120"/>
+        <w:spacing w:before="240" w:after="120"/>
       </w:pPr>
       <w:r>
-        <w:t>6. Resumo Estatístico</w:t>
+        <w:t>6. Números</w:t>
       </w:r>
     </w:p>
     <w:tbl>
@@ -1831,43 +2047,45 @@
         <w:tblLook w:firstColumn="1" w:firstRow="1" w:lastColumn="0" w:lastRow="0" w:noHBand="0" w:noVBand="1" w:val="04A0"/>
       </w:tblPr>
       <w:tblGrid>
-        <w:gridCol w:w="4702"/>
-        <w:gridCol w:w="4702"/>
+        <w:gridCol w:w="4535"/>
+        <w:gridCol w:w="4535"/>
       </w:tblGrid>
       <w:tr>
         <w:tc>
           <w:tcPr>
-            <w:tcW w:type="dxa" w:w="4702"/>
+            <w:tcW w:type="dxa" w:w="4535"/>
           </w:tcPr>
           <w:p>
             <w:pPr>
-              <w:spacing w:after="0"/>
+              <w:spacing w:after="0" w:before="0"/>
             </w:pPr>
             <w:r/>
             <w:r>
               <w:rPr>
+                <w:rFonts w:ascii="Times New Roman" w:hAnsi="Times New Roman"/>
                 <w:b/>
-                <w:sz w:val="22"/>
+                <w:sz w:val="20"/>
               </w:rPr>
-              <w:t>Total de commits no repositório</w:t>
+              <w:t>Commits no GitHub até 23/10/2026</w:t>
             </w:r>
           </w:p>
         </w:tc>
         <w:tc>
           <w:tcPr>
-            <w:tcW w:type="dxa" w:w="4702"/>
+            <w:tcW w:type="dxa" w:w="4535"/>
           </w:tcPr>
           <w:p>
             <w:pPr>
-              <w:spacing w:after="0"/>
+              <w:spacing w:after="0" w:before="0"/>
             </w:pPr>
             <w:r/>
             <w:r>
               <w:rPr>
+                <w:rFonts w:ascii="Times New Roman" w:hAnsi="Times New Roman"/>
                 <w:b w:val="0"/>
-                <w:sz w:val="22"/>
+                <w:sz w:val="20"/>
               </w:rPr>
-              <w:t>13</w:t>
+              <w:t>14</w:t>
             </w:r>
           </w:p>
         </w:tc>
@@ -1875,37 +2093,39 @@
       <w:tr>
         <w:tc>
           <w:tcPr>
-            <w:tcW w:type="dxa" w:w="4702"/>
+            <w:tcW w:type="dxa" w:w="4535"/>
           </w:tcPr>
           <w:p>
             <w:pPr>
-              <w:spacing w:after="0"/>
+              <w:spacing w:after="0" w:before="0"/>
             </w:pPr>
             <w:r/>
             <w:r>
               <w:rPr>
+                <w:rFonts w:ascii="Times New Roman" w:hAnsi="Times New Roman"/>
                 <w:b/>
-                <w:sz w:val="22"/>
+                <w:sz w:val="20"/>
               </w:rPr>
-              <w:t>Commits com auxílio de IA (fundo amarelo)</w:t>
+              <w:t>Com IA registrada ou aplicação do cloud agent</w:t>
             </w:r>
           </w:p>
         </w:tc>
         <w:tc>
           <w:tcPr>
-            <w:tcW w:type="dxa" w:w="4702"/>
+            <w:tcW w:type="dxa" w:w="4535"/>
           </w:tcPr>
           <w:p>
             <w:pPr>
-              <w:spacing w:after="0"/>
+              <w:spacing w:after="0" w:before="0"/>
             </w:pPr>
             <w:r/>
             <w:r>
               <w:rPr>
+                <w:rFonts w:ascii="Times New Roman" w:hAnsi="Times New Roman"/>
                 <w:b w:val="0"/>
-                <w:sz w:val="22"/>
+                <w:sz w:val="20"/>
               </w:rPr>
-              <w:t>9</w:t>
+              <w:t>11</w:t>
             </w:r>
           </w:p>
         </w:tc>
@@ -1913,37 +2133,39 @@
       <w:tr>
         <w:tc>
           <w:tcPr>
-            <w:tcW w:type="dxa" w:w="4702"/>
+            <w:tcW w:type="dxa" w:w="4535"/>
           </w:tcPr>
           <w:p>
             <w:pPr>
-              <w:spacing w:after="0"/>
+              <w:spacing w:after="0" w:before="0"/>
             </w:pPr>
             <w:r/>
             <w:r>
               <w:rPr>
+                <w:rFonts w:ascii="Times New Roman" w:hAnsi="Times New Roman"/>
                 <w:b/>
-                <w:sz w:val="22"/>
+                <w:sz w:val="20"/>
               </w:rPr>
-              <w:t>Commits somente da equipe (fundo branco)</w:t>
+              <w:t>Somente da equipe</w:t>
             </w:r>
           </w:p>
         </w:tc>
         <w:tc>
           <w:tcPr>
-            <w:tcW w:type="dxa" w:w="4702"/>
+            <w:tcW w:type="dxa" w:w="4535"/>
           </w:tcPr>
           <w:p>
             <w:pPr>
-              <w:spacing w:after="0"/>
+              <w:spacing w:after="0" w:before="0"/>
             </w:pPr>
             <w:r/>
             <w:r>
               <w:rPr>
+                <w:rFonts w:ascii="Times New Roman" w:hAnsi="Times New Roman"/>
                 <w:b w:val="0"/>
-                <w:sz w:val="22"/>
+                <w:sz w:val="20"/>
               </w:rPr>
-              <w:t>4</w:t>
+              <w:t>3</w:t>
             </w:r>
           </w:p>
         </w:tc>
@@ -1951,35 +2173,77 @@
       <w:tr>
         <w:tc>
           <w:tcPr>
-            <w:tcW w:type="dxa" w:w="4702"/>
+            <w:tcW w:type="dxa" w:w="4535"/>
           </w:tcPr>
           <w:p>
             <w:pPr>
-              <w:spacing w:after="0"/>
+              <w:spacing w:after="0" w:before="0"/>
             </w:pPr>
             <w:r/>
             <w:r>
               <w:rPr>
+                <w:rFonts w:ascii="Times New Roman" w:hAnsi="Times New Roman"/>
                 <w:b/>
-                <w:sz w:val="22"/>
+                <w:sz w:val="20"/>
               </w:rPr>
-              <w:t>Repositório GitHub</w:t>
+              <w:t>Branches além do master</w:t>
             </w:r>
           </w:p>
         </w:tc>
         <w:tc>
           <w:tcPr>
-            <w:tcW w:type="dxa" w:w="4702"/>
+            <w:tcW w:type="dxa" w:w="4535"/>
           </w:tcPr>
           <w:p>
             <w:pPr>
-              <w:spacing w:after="0"/>
+              <w:spacing w:after="0" w:before="0"/>
             </w:pPr>
             <w:r/>
             <w:r>
               <w:rPr>
+                <w:rFonts w:ascii="Times New Roman" w:hAnsi="Times New Roman"/>
                 <w:b w:val="0"/>
-                <w:sz w:val="22"/>
+                <w:sz w:val="20"/>
+              </w:rPr>
+              <w:t>cursor/corrigir-leitura-disco-2731; cursor/cloud-agent-1792757833804-ojiac; cursor/declaracao-uso-ia-1680</w:t>
+            </w:r>
+          </w:p>
+        </w:tc>
+      </w:tr>
+      <w:tr>
+        <w:tc>
+          <w:tcPr>
+            <w:tcW w:type="dxa" w:w="4535"/>
+          </w:tcPr>
+          <w:p>
+            <w:pPr>
+              <w:spacing w:after="0" w:before="0"/>
+            </w:pPr>
+            <w:r/>
+            <w:r>
+              <w:rPr>
+                <w:rFonts w:ascii="Times New Roman" w:hAnsi="Times New Roman"/>
+                <w:b/>
+                <w:sz w:val="20"/>
+              </w:rPr>
+              <w:t>Repositório</w:t>
+            </w:r>
+          </w:p>
+        </w:tc>
+        <w:tc>
+          <w:tcPr>
+            <w:tcW w:type="dxa" w:w="4535"/>
+          </w:tcPr>
+          <w:p>
+            <w:pPr>
+              <w:spacing w:after="0" w:before="0"/>
+            </w:pPr>
+            <w:r/>
+            <w:r>
+              <w:rPr>
+                <w:rFonts w:ascii="Times New Roman" w:hAnsi="Times New Roman"/>
+                <w:b w:val="0"/>
+                <w:sz w:val="20"/>
               </w:rPr>
               <w:t>https://github.com/jbr121/CRONOTACOGRAFOS</w:t>
             </w:r>
@@ -1991,38 +2255,55 @@
     <w:p>
       <w:pPr>
         <w:pStyle w:val="Heading2"/>
-        <w:spacing w:before="280" w:after="120"/>
+        <w:spacing w:before="240" w:after="120"/>
       </w:pPr>
       <w:r>
-        <w:t>7. Declaração e Assinaturas</w:t>
+        <w:t>7. Declaração</w:t>
       </w:r>
     </w:p>
     <w:p>
       <w:pPr>
-        <w:spacing w:after="120"/>
+        <w:spacing w:after="120" w:line="276" w:lineRule="auto"/>
         <w:jc w:val="both"/>
       </w:pPr>
       <w:r>
         <w:rPr>
+          <w:rFonts w:ascii="Times New Roman" w:hAnsi="Times New Roman"/>
           <w:b w:val="0"/>
           <w:sz w:val="24"/>
         </w:rPr>
-        <w:t>Os abaixo assinados declaram que as informações acima são verdadeiras e que o uso da IA foi realizado de forma ética, transparente e sob supervisão da equipe, em conformidade com as diretrizes da UNIVALI para projetos integradores.</w:t>
+        <w:t>A correção desta declaração (datas no horário de São Paulo, branch de cada commit e o 9842a38 marcado como uso de IA) entra no commit seguinte ao c392737, com a mensagem docs: corrige datas, branches e classificação de IA na declaração.</w:t>
+      </w:r>
+    </w:p>
+    <w:p>
+      <w:pPr>
+        <w:spacing w:after="120" w:line="276" w:lineRule="auto"/>
+        <w:jc w:val="both"/>
+      </w:pPr>
+      <w:r>
+        <w:rPr>
+          <w:rFonts w:ascii="Times New Roman" w:hAnsi="Times New Roman"/>
+          <w:b w:val="0"/>
+          <w:sz w:val="24"/>
+        </w:rPr>
+        <w:t>Declaramos que a tabela acima corresponde ao histórico do GitHub na data desta entrega e que o uso de IA foi supervisionado pela equipe.</w:t>
       </w:r>
     </w:p>
     <w:p/>
     <w:p>
       <w:r>
         <w:rPr>
-          <w:sz w:val="22"/>
+          <w:rFonts w:ascii="Times New Roman" w:hAnsi="Times New Roman"/>
+          <w:sz w:val="24"/>
         </w:rPr>
-        <w:t>_______________________________________________________</w:t>
+        <w:t>________________________________________________</w:t>
       </w:r>
     </w:p>
     <w:p>
       <w:r>
         <w:rPr>
-          <w:sz w:val="22"/>
+          <w:rFonts w:ascii="Times New Roman" w:hAnsi="Times New Roman"/>
+          <w:sz w:val="24"/>
         </w:rPr>
         <w:t>José Eduardo</w:t>
       </w:r>
@@ -2031,15 +2312,17 @@
     <w:p>
       <w:r>
         <w:rPr>
-          <w:sz w:val="22"/>
+          <w:rFonts w:ascii="Times New Roman" w:hAnsi="Times New Roman"/>
+          <w:sz w:val="24"/>
         </w:rPr>
-        <w:t>_______________________________________________________</w:t>
+        <w:t>________________________________________________</w:t>
       </w:r>
     </w:p>
     <w:p>
       <w:r>
         <w:rPr>
-          <w:sz w:val="22"/>
+          <w:rFonts w:ascii="Times New Roman" w:hAnsi="Times New Roman"/>
+          <w:sz w:val="24"/>
         </w:rPr>
         <w:t>Márcio Fossa</w:t>
       </w:r>
@@ -2048,22 +2331,24 @@
     <w:p>
       <w:r>
         <w:rPr>
-          <w:sz w:val="22"/>
+          <w:rFonts w:ascii="Times New Roman" w:hAnsi="Times New Roman"/>
+          <w:sz w:val="24"/>
         </w:rPr>
-        <w:t>_______________________________________________________</w:t>
+        <w:t>________________________________________________</w:t>
       </w:r>
     </w:p>
     <w:p>
       <w:r>
         <w:rPr>
-          <w:sz w:val="22"/>
+          <w:rFonts w:ascii="Times New Roman" w:hAnsi="Times New Roman"/>
+          <w:sz w:val="24"/>
         </w:rPr>
         <w:t>Erick Franzmann Bortoloti</w:t>
       </w:r>
     </w:p>
     <w:p/>
     <w:sectPr>
-      <w:pgSz w:w="12240" w:h="15840"/>
+      <w:pgSz w:w="11906" w:h="16838"/>
       <w:pgMar w:top="1701" w:right="1134" w:bottom="1134" w:left="1701" w:header="720" w:footer="720" w:gutter="0"/>
       <w:cols w:space="720"/>
       <w:docGrid w:linePitch="360"/>

</xml_diff>